<commit_message>
Fix explainer: correct segment approval rates and add Fair margin caveat
Overall approval rates now accurately reflect ineligible exclusions (66%/83%/88%
for Excellent/Good/Fair, not 100%). Adds two new limitation sections: Fair segment
is only 2.3% below its profitability breakeven (fragile), and the 5% portfolio
risk cap is never binding (all decisions are purely profitability-driven).

Co-Authored-By: Claude Sonnet 4.6 <noreply@anthropic.com>
</commit_message>
<xml_diff>
--- a/submission/Term_Extension_Optimisation_Explainer.docx
+++ b/submission/Term_Extension_Optimisation_Explainer.docx
@@ -1846,15 +1846,17 @@
         <w:tblLook w:firstColumn="1" w:firstRow="1" w:lastColumn="0" w:lastRow="0" w:noHBand="0" w:noVBand="1" w:val="04A0"/>
       </w:tblPr>
       <w:tblGrid>
-        <w:gridCol w:w="2209"/>
-        <w:gridCol w:w="2209"/>
-        <w:gridCol w:w="2209"/>
-        <w:gridCol w:w="2209"/>
+        <w:gridCol w:w="1473"/>
+        <w:gridCol w:w="1473"/>
+        <w:gridCol w:w="1473"/>
+        <w:gridCol w:w="1473"/>
+        <w:gridCol w:w="1473"/>
+        <w:gridCol w:w="1473"/>
       </w:tblGrid>
       <w:tr>
         <w:tc>
           <w:tcPr>
-            <w:tcW w:type="dxa" w:w="2209"/>
+            <w:tcW w:type="dxa" w:w="1473"/>
             <w:shd w:val="clear" w:color="auto" w:fill="1A4A6B"/>
           </w:tcPr>
           <w:p>
@@ -1873,7 +1875,7 @@
         </w:tc>
         <w:tc>
           <w:tcPr>
-            <w:tcW w:type="dxa" w:w="2209"/>
+            <w:tcW w:type="dxa" w:w="1473"/>
             <w:shd w:val="clear" w:color="auto" w:fill="1A4A6B"/>
           </w:tcPr>
           <w:p>
@@ -1892,7 +1894,7 @@
         </w:tc>
         <w:tc>
           <w:tcPr>
-            <w:tcW w:type="dxa" w:w="2209"/>
+            <w:tcW w:type="dxa" w:w="1473"/>
             <w:shd w:val="clear" w:color="auto" w:fill="1A4A6B"/>
           </w:tcPr>
           <w:p>
@@ -1905,13 +1907,13 @@
                 <w:color w:val="FFFFFF"/>
                 <w:sz w:val="20"/>
               </w:rPr>
-              <w:t>Extensions Granted</w:t>
+              <w:t>Ineligible</w:t>
             </w:r>
           </w:p>
         </w:tc>
         <w:tc>
           <w:tcPr>
-            <w:tcW w:type="dxa" w:w="2209"/>
+            <w:tcW w:type="dxa" w:w="1473"/>
             <w:shd w:val="clear" w:color="auto" w:fill="1A4A6B"/>
           </w:tcPr>
           <w:p>
@@ -1924,7 +1926,45 @@
                 <w:color w:val="FFFFFF"/>
                 <w:sz w:val="20"/>
               </w:rPr>
-              <w:t>Approval Rate</w:t>
+              <w:t>Eligible</w:t>
+            </w:r>
+          </w:p>
+        </w:tc>
+        <w:tc>
+          <w:tcPr>
+            <w:tcW w:type="dxa" w:w="1473"/>
+            <w:shd w:val="clear" w:color="auto" w:fill="1A4A6B"/>
+          </w:tcPr>
+          <w:p>
+            <w:pPr>
+              <w:jc w:val="center"/>
+            </w:pPr>
+            <w:r>
+              <w:rPr>
+                <w:b/>
+                <w:color w:val="FFFFFF"/>
+                <w:sz w:val="20"/>
+              </w:rPr>
+              <w:t>Granted (eligible)</w:t>
+            </w:r>
+          </w:p>
+        </w:tc>
+        <w:tc>
+          <w:tcPr>
+            <w:tcW w:type="dxa" w:w="1473"/>
+            <w:shd w:val="clear" w:color="auto" w:fill="1A4A6B"/>
+          </w:tcPr>
+          <w:p>
+            <w:pPr>
+              <w:jc w:val="center"/>
+            </w:pPr>
+            <w:r>
+              <w:rPr>
+                <w:b/>
+                <w:color w:val="FFFFFF"/>
+                <w:sz w:val="20"/>
+              </w:rPr>
+              <w:t>Granted (overall)</w:t>
             </w:r>
           </w:p>
         </w:tc>
@@ -1932,7 +1972,7 @@
       <w:tr>
         <w:tc>
           <w:tcPr>
-            <w:tcW w:type="dxa" w:w="2209"/>
+            <w:tcW w:type="dxa" w:w="1473"/>
             <w:shd w:val="clear" w:color="auto" w:fill="E8F4F8"/>
           </w:tcPr>
           <w:p>
@@ -1949,7 +1989,7 @@
         </w:tc>
         <w:tc>
           <w:tcPr>
-            <w:tcW w:type="dxa" w:w="2209"/>
+            <w:tcW w:type="dxa" w:w="1473"/>
             <w:shd w:val="clear" w:color="auto" w:fill="E8F4F8"/>
           </w:tcPr>
           <w:p>
@@ -1960,13 +2000,13 @@
               <w:rPr>
                 <w:sz w:val="20"/>
               </w:rPr>
-              <w:t>~6,750</w:t>
+              <w:t>6,329</w:t>
             </w:r>
           </w:p>
         </w:tc>
         <w:tc>
           <w:tcPr>
-            <w:tcW w:type="dxa" w:w="2209"/>
+            <w:tcW w:type="dxa" w:w="1473"/>
             <w:shd w:val="clear" w:color="auto" w:fill="E8F4F8"/>
           </w:tcPr>
           <w:p>
@@ -1977,13 +2017,13 @@
               <w:rPr>
                 <w:sz w:val="20"/>
               </w:rPr>
-              <w:t>~6,750</w:t>
+              <w:t>2,148</w:t>
             </w:r>
           </w:p>
         </w:tc>
         <w:tc>
           <w:tcPr>
-            <w:tcW w:type="dxa" w:w="2209"/>
+            <w:tcW w:type="dxa" w:w="1473"/>
             <w:shd w:val="clear" w:color="auto" w:fill="E8F4F8"/>
           </w:tcPr>
           <w:p>
@@ -1994,7 +2034,41 @@
               <w:rPr>
                 <w:sz w:val="20"/>
               </w:rPr>
-              <w:t>100%</w:t>
+              <w:t>4,181</w:t>
+            </w:r>
+          </w:p>
+        </w:tc>
+        <w:tc>
+          <w:tcPr>
+            <w:tcW w:type="dxa" w:w="1473"/>
+            <w:shd w:val="clear" w:color="auto" w:fill="E8F4F8"/>
+          </w:tcPr>
+          <w:p>
+            <w:pPr>
+              <w:jc w:val="center"/>
+            </w:pPr>
+            <w:r>
+              <w:rPr>
+                <w:sz w:val="20"/>
+              </w:rPr>
+              <w:t>4,181  (100%)</w:t>
+            </w:r>
+          </w:p>
+        </w:tc>
+        <w:tc>
+          <w:tcPr>
+            <w:tcW w:type="dxa" w:w="1473"/>
+            <w:shd w:val="clear" w:color="auto" w:fill="E8F4F8"/>
+          </w:tcPr>
+          <w:p>
+            <w:pPr>
+              <w:jc w:val="center"/>
+            </w:pPr>
+            <w:r>
+              <w:rPr>
+                <w:sz w:val="20"/>
+              </w:rPr>
+              <w:t>4,181  (66.1%)</w:t>
             </w:r>
           </w:p>
         </w:tc>
@@ -2002,7 +2076,7 @@
       <w:tr>
         <w:tc>
           <w:tcPr>
-            <w:tcW w:type="dxa" w:w="2209"/>
+            <w:tcW w:type="dxa" w:w="1473"/>
             <w:shd w:val="clear" w:color="auto" w:fill="FFFFFF"/>
           </w:tcPr>
           <w:p>
@@ -2019,7 +2093,7 @@
         </w:tc>
         <w:tc>
           <w:tcPr>
-            <w:tcW w:type="dxa" w:w="2209"/>
+            <w:tcW w:type="dxa" w:w="1473"/>
             <w:shd w:val="clear" w:color="auto" w:fill="FFFFFF"/>
           </w:tcPr>
           <w:p>
@@ -2030,13 +2104,13 @@
               <w:rPr>
                 <w:sz w:val="20"/>
               </w:rPr>
-              <w:t>~12,400</w:t>
+              <w:t>9,209</w:t>
             </w:r>
           </w:p>
         </w:tc>
         <w:tc>
           <w:tcPr>
-            <w:tcW w:type="dxa" w:w="2209"/>
+            <w:tcW w:type="dxa" w:w="1473"/>
             <w:shd w:val="clear" w:color="auto" w:fill="FFFFFF"/>
           </w:tcPr>
           <w:p>
@@ -2047,13 +2121,13 @@
               <w:rPr>
                 <w:sz w:val="20"/>
               </w:rPr>
-              <w:t>~12,400</w:t>
+              <w:t>1,602</w:t>
             </w:r>
           </w:p>
         </w:tc>
         <w:tc>
           <w:tcPr>
-            <w:tcW w:type="dxa" w:w="2209"/>
+            <w:tcW w:type="dxa" w:w="1473"/>
             <w:shd w:val="clear" w:color="auto" w:fill="FFFFFF"/>
           </w:tcPr>
           <w:p>
@@ -2064,7 +2138,41 @@
               <w:rPr>
                 <w:sz w:val="20"/>
               </w:rPr>
-              <w:t>100%</w:t>
+              <w:t>7,607</w:t>
+            </w:r>
+          </w:p>
+        </w:tc>
+        <w:tc>
+          <w:tcPr>
+            <w:tcW w:type="dxa" w:w="1473"/>
+            <w:shd w:val="clear" w:color="auto" w:fill="FFFFFF"/>
+          </w:tcPr>
+          <w:p>
+            <w:pPr>
+              <w:jc w:val="center"/>
+            </w:pPr>
+            <w:r>
+              <w:rPr>
+                <w:sz w:val="20"/>
+              </w:rPr>
+              <w:t>7,607  (100%)</w:t>
+            </w:r>
+          </w:p>
+        </w:tc>
+        <w:tc>
+          <w:tcPr>
+            <w:tcW w:type="dxa" w:w="1473"/>
+            <w:shd w:val="clear" w:color="auto" w:fill="FFFFFF"/>
+          </w:tcPr>
+          <w:p>
+            <w:pPr>
+              <w:jc w:val="center"/>
+            </w:pPr>
+            <w:r>
+              <w:rPr>
+                <w:sz w:val="20"/>
+              </w:rPr>
+              <w:t>7,607  (82.6%)</w:t>
             </w:r>
           </w:p>
         </w:tc>
@@ -2072,7 +2180,7 @@
       <w:tr>
         <w:tc>
           <w:tcPr>
-            <w:tcW w:type="dxa" w:w="2209"/>
+            <w:tcW w:type="dxa" w:w="1473"/>
             <w:shd w:val="clear" w:color="auto" w:fill="E8F4F8"/>
           </w:tcPr>
           <w:p>
@@ -2089,7 +2197,7 @@
         </w:tc>
         <w:tc>
           <w:tcPr>
-            <w:tcW w:type="dxa" w:w="2209"/>
+            <w:tcW w:type="dxa" w:w="1473"/>
             <w:shd w:val="clear" w:color="auto" w:fill="E8F4F8"/>
           </w:tcPr>
           <w:p>
@@ -2100,13 +2208,13 @@
               <w:rPr>
                 <w:sz w:val="20"/>
               </w:rPr>
-              <w:t>~8,100</w:t>
+              <w:t>9,000</w:t>
             </w:r>
           </w:p>
         </w:tc>
         <w:tc>
           <w:tcPr>
-            <w:tcW w:type="dxa" w:w="2209"/>
+            <w:tcW w:type="dxa" w:w="1473"/>
             <w:shd w:val="clear" w:color="auto" w:fill="E8F4F8"/>
           </w:tcPr>
           <w:p>
@@ -2117,13 +2225,13 @@
               <w:rPr>
                 <w:sz w:val="20"/>
               </w:rPr>
-              <w:t>~8,100</w:t>
+              <w:t>1,071</w:t>
             </w:r>
           </w:p>
         </w:tc>
         <w:tc>
           <w:tcPr>
-            <w:tcW w:type="dxa" w:w="2209"/>
+            <w:tcW w:type="dxa" w:w="1473"/>
             <w:shd w:val="clear" w:color="auto" w:fill="E8F4F8"/>
           </w:tcPr>
           <w:p>
@@ -2134,7 +2242,41 @@
               <w:rPr>
                 <w:sz w:val="20"/>
               </w:rPr>
-              <w:t>100%</w:t>
+              <w:t>7,929</w:t>
+            </w:r>
+          </w:p>
+        </w:tc>
+        <w:tc>
+          <w:tcPr>
+            <w:tcW w:type="dxa" w:w="1473"/>
+            <w:shd w:val="clear" w:color="auto" w:fill="E8F4F8"/>
+          </w:tcPr>
+          <w:p>
+            <w:pPr>
+              <w:jc w:val="center"/>
+            </w:pPr>
+            <w:r>
+              <w:rPr>
+                <w:sz w:val="20"/>
+              </w:rPr>
+              <w:t>7,929  (100%)</w:t>
+            </w:r>
+          </w:p>
+        </w:tc>
+        <w:tc>
+          <w:tcPr>
+            <w:tcW w:type="dxa" w:w="1473"/>
+            <w:shd w:val="clear" w:color="auto" w:fill="E8F4F8"/>
+          </w:tcPr>
+          <w:p>
+            <w:pPr>
+              <w:jc w:val="center"/>
+            </w:pPr>
+            <w:r>
+              <w:rPr>
+                <w:sz w:val="20"/>
+              </w:rPr>
+              <w:t>7,929  (88.1%)</w:t>
             </w:r>
           </w:p>
         </w:tc>
@@ -2142,7 +2284,7 @@
       <w:tr>
         <w:tc>
           <w:tcPr>
-            <w:tcW w:type="dxa" w:w="2209"/>
+            <w:tcW w:type="dxa" w:w="1473"/>
             <w:shd w:val="clear" w:color="auto" w:fill="FFFFFF"/>
           </w:tcPr>
           <w:p>
@@ -2159,7 +2301,7 @@
         </w:tc>
         <w:tc>
           <w:tcPr>
-            <w:tcW w:type="dxa" w:w="2209"/>
+            <w:tcW w:type="dxa" w:w="1473"/>
             <w:shd w:val="clear" w:color="auto" w:fill="FFFFFF"/>
           </w:tcPr>
           <w:p>
@@ -2170,13 +2312,13 @@
               <w:rPr>
                 <w:sz w:val="20"/>
               </w:rPr>
-              <w:t>~2,818</w:t>
+              <w:t>5,462</w:t>
             </w:r>
           </w:p>
         </w:tc>
         <w:tc>
           <w:tcPr>
-            <w:tcW w:type="dxa" w:w="2209"/>
+            <w:tcW w:type="dxa" w:w="1473"/>
             <w:shd w:val="clear" w:color="auto" w:fill="FFFFFF"/>
           </w:tcPr>
           <w:p>
@@ -2187,13 +2329,13 @@
               <w:rPr>
                 <w:sz w:val="20"/>
               </w:rPr>
-              <w:t>~1,790</w:t>
+              <w:t>111</w:t>
             </w:r>
           </w:p>
         </w:tc>
         <w:tc>
           <w:tcPr>
-            <w:tcW w:type="dxa" w:w="2209"/>
+            <w:tcW w:type="dxa" w:w="1473"/>
             <w:shd w:val="clear" w:color="auto" w:fill="FFFFFF"/>
           </w:tcPr>
           <w:p>
@@ -2204,7 +2346,41 @@
               <w:rPr>
                 <w:sz w:val="20"/>
               </w:rPr>
-              <w:t>~63.5%</w:t>
+              <w:t>5,351</w:t>
+            </w:r>
+          </w:p>
+        </w:tc>
+        <w:tc>
+          <w:tcPr>
+            <w:tcW w:type="dxa" w:w="1473"/>
+            <w:shd w:val="clear" w:color="auto" w:fill="FFFFFF"/>
+          </w:tcPr>
+          <w:p>
+            <w:pPr>
+              <w:jc w:val="center"/>
+            </w:pPr>
+            <w:r>
+              <w:rPr>
+                <w:sz w:val="20"/>
+              </w:rPr>
+              <w:t>3,996  (74.7%)</w:t>
+            </w:r>
+          </w:p>
+        </w:tc>
+        <w:tc>
+          <w:tcPr>
+            <w:tcW w:type="dxa" w:w="1473"/>
+            <w:shd w:val="clear" w:color="auto" w:fill="FFFFFF"/>
+          </w:tcPr>
+          <w:p>
+            <w:pPr>
+              <w:jc w:val="center"/>
+            </w:pPr>
+            <w:r>
+              <w:rPr>
+                <w:sz w:val="20"/>
+              </w:rPr>
+              <w:t>3,996  (73.2%)</w:t>
             </w:r>
           </w:p>
         </w:tc>
@@ -2212,7 +2388,7 @@
       <w:tr>
         <w:tc>
           <w:tcPr>
-            <w:tcW w:type="dxa" w:w="2209"/>
+            <w:tcW w:type="dxa" w:w="1473"/>
             <w:shd w:val="clear" w:color="auto" w:fill="E8F4F8"/>
           </w:tcPr>
           <w:p>
@@ -2223,13 +2399,30 @@
               <w:rPr>
                 <w:sz w:val="20"/>
               </w:rPr>
-              <w:t>Ineligible</w:t>
+              <w:t>TOTAL</w:t>
             </w:r>
           </w:p>
         </w:tc>
         <w:tc>
           <w:tcPr>
-            <w:tcW w:type="dxa" w:w="2209"/>
+            <w:tcW w:type="dxa" w:w="1473"/>
+            <w:shd w:val="clear" w:color="auto" w:fill="E8F4F8"/>
+          </w:tcPr>
+          <w:p>
+            <w:pPr>
+              <w:jc w:val="center"/>
+            </w:pPr>
+            <w:r>
+              <w:rPr>
+                <w:sz w:val="20"/>
+              </w:rPr>
+              <w:t>30,000</w:t>
+            </w:r>
+          </w:p>
+        </w:tc>
+        <w:tc>
+          <w:tcPr>
+            <w:tcW w:type="dxa" w:w="1473"/>
             <w:shd w:val="clear" w:color="auto" w:fill="E8F4F8"/>
           </w:tcPr>
           <w:p>
@@ -2246,7 +2439,7 @@
         </w:tc>
         <w:tc>
           <w:tcPr>
-            <w:tcW w:type="dxa" w:w="2209"/>
+            <w:tcW w:type="dxa" w:w="1473"/>
             <w:shd w:val="clear" w:color="auto" w:fill="E8F4F8"/>
           </w:tcPr>
           <w:p>
@@ -2257,13 +2450,13 @@
               <w:rPr>
                 <w:sz w:val="20"/>
               </w:rPr>
-              <w:t>0</w:t>
+              <w:t>25,068</w:t>
             </w:r>
           </w:p>
         </w:tc>
         <w:tc>
           <w:tcPr>
-            <w:tcW w:type="dxa" w:w="2209"/>
+            <w:tcW w:type="dxa" w:w="1473"/>
             <w:shd w:val="clear" w:color="auto" w:fill="E8F4F8"/>
           </w:tcPr>
           <w:p>
@@ -2274,16 +2467,14 @@
               <w:rPr>
                 <w:sz w:val="20"/>
               </w:rPr>
-              <w:t>0% (excluded)</w:t>
+              <w:t>23,713  (94.6%)</w:t>
             </w:r>
           </w:p>
         </w:tc>
-      </w:tr>
-      <w:tr>
         <w:tc>
           <w:tcPr>
-            <w:tcW w:type="dxa" w:w="2209"/>
-            <w:shd w:val="clear" w:color="auto" w:fill="FFFFFF"/>
+            <w:tcW w:type="dxa" w:w="1473"/>
+            <w:shd w:val="clear" w:color="auto" w:fill="E8F4F8"/>
           </w:tcPr>
           <w:p>
             <w:pPr>
@@ -2293,58 +2484,7 @@
               <w:rPr>
                 <w:sz w:val="20"/>
               </w:rPr>
-              <w:t>TOTAL</w:t>
-            </w:r>
-          </w:p>
-        </w:tc>
-        <w:tc>
-          <w:tcPr>
-            <w:tcW w:type="dxa" w:w="2209"/>
-            <w:shd w:val="clear" w:color="auto" w:fill="FFFFFF"/>
-          </w:tcPr>
-          <w:p>
-            <w:pPr>
-              <w:jc w:val="center"/>
-            </w:pPr>
-            <w:r>
-              <w:rPr>
-                <w:sz w:val="20"/>
-              </w:rPr>
-              <w:t>30,000</w:t>
-            </w:r>
-          </w:p>
-        </w:tc>
-        <w:tc>
-          <w:tcPr>
-            <w:tcW w:type="dxa" w:w="2209"/>
-            <w:shd w:val="clear" w:color="auto" w:fill="FFFFFF"/>
-          </w:tcPr>
-          <w:p>
-            <w:pPr>
-              <w:jc w:val="center"/>
-            </w:pPr>
-            <w:r>
-              <w:rPr>
-                <w:sz w:val="20"/>
-              </w:rPr>
-              <w:t>23,713</w:t>
-            </w:r>
-          </w:p>
-        </w:tc>
-        <w:tc>
-          <w:tcPr>
-            <w:tcW w:type="dxa" w:w="2209"/>
-            <w:shd w:val="clear" w:color="auto" w:fill="FFFFFF"/>
-          </w:tcPr>
-          <w:p>
-            <w:pPr>
-              <w:jc w:val="center"/>
-            </w:pPr>
-            <w:r>
-              <w:rPr>
-                <w:sz w:val="20"/>
-              </w:rPr>
-              <w:t>79.0%</w:t>
+              <w:t>23,713  (79.0%)</w:t>
             </w:r>
           </w:p>
         </w:tc>
@@ -2364,7 +2504,7 @@
           <w:color w:val="333333"/>
           <w:sz w:val="21"/>
         </w:rPr>
-        <w:t>Excellent, Good, and Fair customers are approved at 100% because the $40 fee comfortably covers their expected loss. Poor customers face a 36.5% rejection rate where individual default risk is too high to be profitable. Ineligible customers (last loan &lt; 60 days) are excluded by policy regardless of credit score.</w:t>
+        <w:t>Ineligible customers (last loan &lt; 60 days ago) are excluded by policy regardless of credit score — they account for all denials in the Excellent, Good, and Fair segments. Among eligible customers, Excellent/Good/Fair are approved at 100% because the $40 fee comfortably covers expected losses at their default rates. Poor customers face a 25.3% eligible rejection rate: those with larger loan balances and higher default risk produce expected losses that exceed the $40 fee, making the extension unprofitable.</w:t>
       </w:r>
     </w:p>
     <w:p>
@@ -3262,6 +3402,56 @@
           <w:sz w:val="21"/>
         </w:rPr>
         <w:t>Revenue is modelled as a fixed $40 relationship fee. If the actual fee structure differs — for example, if it is a percentage of the outstanding balance, or if it varies by customer segment — the profit figures should be recalculated accordingly.</w:t>
+      </w:r>
+    </w:p>
+    <w:p>
+      <w:pPr>
+        <w:spacing w:before="200" w:after="60"/>
+      </w:pPr>
+      <w:r>
+        <w:rPr>
+          <w:b/>
+          <w:color w:val="007A8A"/>
+          <w:sz w:val="23"/>
+        </w:rPr>
+        <w:t>Fair segment approval is margin-sensitive</w:t>
+      </w:r>
+    </w:p>
+    <w:p>
+      <w:pPr>
+        <w:spacing w:before="0" w:after="120"/>
+      </w:pPr>
+      <w:r>
+        <w:rPr>
+          <w:color w:val="333333"/>
+          <w:sz w:val="21"/>
+        </w:rPr>
+        <w:t>Among eligible Fair customers, the model approves 100%. However, this is a narrow outcome: the highest-risk Fair customers sit just below the profitability breakeven (maximum risk-exposure product 78.2 vs. the breakeven of 80.0). A modest calibration change — lower fee, higher estimated default rate, or larger loan balances — would tip some Fair customers into denial. Excellent and Good segments are far more robust (their breakeven headroom is 4–7×). The Fair segment should be monitored closely in early deployment.</w:t>
+      </w:r>
+    </w:p>
+    <w:p>
+      <w:pPr>
+        <w:spacing w:before="200" w:after="60"/>
+      </w:pPr>
+      <w:r>
+        <w:rPr>
+          <w:b/>
+          <w:color w:val="007A8A"/>
+          <w:sz w:val="23"/>
+        </w:rPr>
+        <w:t>Risk cap not binding — all decisions are profitability-driven</w:t>
+      </w:r>
+    </w:p>
+    <w:p>
+      <w:pPr>
+        <w:spacing w:before="0" w:after="120"/>
+      </w:pPr>
+      <w:r>
+        <w:rPr>
+          <w:color w:val="333333"/>
+          <w:sz w:val="21"/>
+        </w:rPr>
+        <w:t>The portfolio risk constraint (5% cap) was never binding: actual portfolio default risk is 0.94%, leaving 4 percentage points of slack. Every approval and denial is determined solely by whether the $40 fee exceeds the expected credit loss for that individual. This means the risk cap provides no additional protection beyond individual profitability filtering. If the business requires a stricter risk ceiling (e.g., 1–2%), a tighter cap should be set explicitly.</w:t>
       </w:r>
     </w:p>
     <w:p>

</xml_diff>

<commit_message>
Add plain-English assumptions section to business explainer
New Section 6 explains all model assumptions for non-technical readers:
credit scoring weights and K-means clustering, macro enrichment (unemployment/
fed rate/GDP effects), Monte Carlo simulation logic (term distribution, hazard
rate, three-outcome structure, flat fee, full-loan loss basis, customer
independence). Each assumption states what it is, why it was chosen, and
what it means in practice.

Co-Authored-By: Claude Sonnet 4.6 <noreply@anthropic.com>
</commit_message>
<xml_diff>
--- a/submission/Term_Extension_Optimisation_Explainer.docx
+++ b/submission/Term_Extension_Optimisation_Explainer.docx
@@ -3489,7 +3489,1346 @@
           <w:color w:val="1A1A2E"/>
           <w:sz w:val="28"/>
         </w:rPr>
-        <w:t>6.  How to Use These Recommendations</w:t>
+        <w:t>6.  Model Assumptions — Plain English</w:t>
+      </w:r>
+    </w:p>
+    <w:p>
+      <w:pPr>
+        <w:spacing w:before="0" w:after="120"/>
+      </w:pPr>
+      <w:r>
+        <w:rPr>
+          <w:color w:val="333333"/>
+          <w:sz w:val="21"/>
+        </w:rPr>
+        <w:t>Every model is built on a set of assumptions — simplifications of reality that make the problem solvable. Below we explain each key assumption in plain terms, why it was made, and what it means in practice.</w:t>
+      </w:r>
+    </w:p>
+    <w:p>
+      <w:pPr>
+        <w:spacing w:before="200" w:after="60"/>
+      </w:pPr>
+      <w:r>
+        <w:rPr>
+          <w:b/>
+          <w:color w:val="007A8A"/>
+          <w:sz w:val="23"/>
+        </w:rPr>
+        <w:t>How customers are grouped into credit tiers</w:t>
+      </w:r>
+    </w:p>
+    <w:p>
+      <w:pPr>
+        <w:spacing w:before="0" w:after="120"/>
+      </w:pPr>
+      <w:r>
+        <w:rPr>
+          <w:color w:val="333333"/>
+          <w:sz w:val="21"/>
+        </w:rPr>
+        <w:t>Before any calculation, every customer receives a single creditworthiness score built from four pieces of information already in our records:</w:t>
+      </w:r>
+    </w:p>
+    <w:tbl>
+      <w:tblPr>
+        <w:tblStyle w:val="TableGrid"/>
+        <w:tblW w:type="auto" w:w="0"/>
+        <w:jc w:val="center"/>
+        <w:tblLook w:firstColumn="1" w:firstRow="1" w:lastColumn="0" w:lastRow="0" w:noHBand="0" w:noVBand="1" w:val="04A0"/>
+      </w:tblPr>
+      <w:tblGrid>
+        <w:gridCol w:w="2946"/>
+        <w:gridCol w:w="2946"/>
+        <w:gridCol w:w="2946"/>
+      </w:tblGrid>
+      <w:tr>
+        <w:tc>
+          <w:tcPr>
+            <w:tcW w:type="dxa" w:w="2946"/>
+            <w:shd w:val="clear" w:color="auto" w:fill="1A4A6B"/>
+          </w:tcPr>
+          <w:p>
+            <w:pPr>
+              <w:jc w:val="center"/>
+            </w:pPr>
+            <w:r>
+              <w:rPr>
+                <w:b/>
+                <w:color w:val="FFFFFF"/>
+                <w:sz w:val="20"/>
+              </w:rPr>
+              <w:t>What we measure</w:t>
+            </w:r>
+          </w:p>
+        </w:tc>
+        <w:tc>
+          <w:tcPr>
+            <w:tcW w:type="dxa" w:w="2946"/>
+            <w:shd w:val="clear" w:color="auto" w:fill="1A4A6B"/>
+          </w:tcPr>
+          <w:p>
+            <w:pPr>
+              <w:jc w:val="center"/>
+            </w:pPr>
+            <w:r>
+              <w:rPr>
+                <w:b/>
+                <w:color w:val="FFFFFF"/>
+                <w:sz w:val="20"/>
+              </w:rPr>
+              <w:t>Weight</w:t>
+            </w:r>
+          </w:p>
+        </w:tc>
+        <w:tc>
+          <w:tcPr>
+            <w:tcW w:type="dxa" w:w="2946"/>
+            <w:shd w:val="clear" w:color="auto" w:fill="1A4A6B"/>
+          </w:tcPr>
+          <w:p>
+            <w:pPr>
+              <w:jc w:val="center"/>
+            </w:pPr>
+            <w:r>
+              <w:rPr>
+                <w:b/>
+                <w:color w:val="FFFFFF"/>
+                <w:sz w:val="20"/>
+              </w:rPr>
+              <w:t>Logic</w:t>
+            </w:r>
+          </w:p>
+        </w:tc>
+      </w:tr>
+      <w:tr>
+        <w:tc>
+          <w:tcPr>
+            <w:tcW w:type="dxa" w:w="2946"/>
+            <w:shd w:val="clear" w:color="auto" w:fill="E8F4F8"/>
+          </w:tcPr>
+          <w:p>
+            <w:pPr>
+              <w:jc w:val="center"/>
+            </w:pPr>
+            <w:r>
+              <w:rPr>
+                <w:sz w:val="20"/>
+              </w:rPr>
+              <w:t>% of payments made on time</w:t>
+            </w:r>
+          </w:p>
+        </w:tc>
+        <w:tc>
+          <w:tcPr>
+            <w:tcW w:type="dxa" w:w="2946"/>
+            <w:shd w:val="clear" w:color="auto" w:fill="E8F4F8"/>
+          </w:tcPr>
+          <w:p>
+            <w:pPr>
+              <w:jc w:val="center"/>
+            </w:pPr>
+            <w:r>
+              <w:rPr>
+                <w:sz w:val="20"/>
+              </w:rPr>
+              <w:t>35%</w:t>
+            </w:r>
+          </w:p>
+        </w:tc>
+        <w:tc>
+          <w:tcPr>
+            <w:tcW w:type="dxa" w:w="2946"/>
+            <w:shd w:val="clear" w:color="auto" w:fill="E8F4F8"/>
+          </w:tcPr>
+          <w:p>
+            <w:pPr>
+              <w:jc w:val="center"/>
+            </w:pPr>
+            <w:r>
+              <w:rPr>
+                <w:sz w:val="20"/>
+              </w:rPr>
+              <w:t>The single strongest predictor of future repayment — mirrors FICO's own published weighting</w:t>
+            </w:r>
+          </w:p>
+        </w:tc>
+      </w:tr>
+      <w:tr>
+        <w:tc>
+          <w:tcPr>
+            <w:tcW w:type="dxa" w:w="2946"/>
+            <w:shd w:val="clear" w:color="auto" w:fill="FFFFFF"/>
+          </w:tcPr>
+          <w:p>
+            <w:pPr>
+              <w:jc w:val="center"/>
+            </w:pPr>
+            <w:r>
+              <w:rPr>
+                <w:sz w:val="20"/>
+              </w:rPr>
+              <w:t>Number of credit-limit requests in 2023</w:t>
+            </w:r>
+          </w:p>
+        </w:tc>
+        <w:tc>
+          <w:tcPr>
+            <w:tcW w:type="dxa" w:w="2946"/>
+            <w:shd w:val="clear" w:color="auto" w:fill="FFFFFF"/>
+          </w:tcPr>
+          <w:p>
+            <w:pPr>
+              <w:jc w:val="center"/>
+            </w:pPr>
+            <w:r>
+              <w:rPr>
+                <w:sz w:val="20"/>
+              </w:rPr>
+              <w:t>30%</w:t>
+            </w:r>
+          </w:p>
+        </w:tc>
+        <w:tc>
+          <w:tcPr>
+            <w:tcW w:type="dxa" w:w="2946"/>
+            <w:shd w:val="clear" w:color="auto" w:fill="FFFFFF"/>
+          </w:tcPr>
+          <w:p>
+            <w:pPr>
+              <w:jc w:val="center"/>
+            </w:pPr>
+            <w:r>
+              <w:rPr>
+                <w:sz w:val="20"/>
+              </w:rPr>
+              <w:t>Frequent requests signal credit-seeking behaviour; fewer requests = better discipline</w:t>
+            </w:r>
+          </w:p>
+        </w:tc>
+      </w:tr>
+      <w:tr>
+        <w:tc>
+          <w:tcPr>
+            <w:tcW w:type="dxa" w:w="2946"/>
+            <w:shd w:val="clear" w:color="auto" w:fill="E8F4F8"/>
+          </w:tcPr>
+          <w:p>
+            <w:pPr>
+              <w:jc w:val="center"/>
+            </w:pPr>
+            <w:r>
+              <w:rPr>
+                <w:sz w:val="20"/>
+              </w:rPr>
+              <w:t>Days since last loan</w:t>
+            </w:r>
+          </w:p>
+        </w:tc>
+        <w:tc>
+          <w:tcPr>
+            <w:tcW w:type="dxa" w:w="2946"/>
+            <w:shd w:val="clear" w:color="auto" w:fill="E8F4F8"/>
+          </w:tcPr>
+          <w:p>
+            <w:pPr>
+              <w:jc w:val="center"/>
+            </w:pPr>
+            <w:r>
+              <w:rPr>
+                <w:sz w:val="20"/>
+              </w:rPr>
+              <w:t>20%</w:t>
+            </w:r>
+          </w:p>
+        </w:tc>
+        <w:tc>
+          <w:tcPr>
+            <w:tcW w:type="dxa" w:w="2946"/>
+            <w:shd w:val="clear" w:color="auto" w:fill="E8F4F8"/>
+          </w:tcPr>
+          <w:p>
+            <w:pPr>
+              <w:jc w:val="center"/>
+            </w:pPr>
+            <w:r>
+              <w:rPr>
+                <w:sz w:val="20"/>
+              </w:rPr>
+              <w:t>Recent borrowers have an active relationship; dormant customers are scored lower</w:t>
+            </w:r>
+          </w:p>
+        </w:tc>
+      </w:tr>
+      <w:tr>
+        <w:tc>
+          <w:tcPr>
+            <w:tcW w:type="dxa" w:w="2946"/>
+            <w:shd w:val="clear" w:color="auto" w:fill="FFFFFF"/>
+          </w:tcPr>
+          <w:p>
+            <w:pPr>
+              <w:jc w:val="center"/>
+            </w:pPr>
+            <w:r>
+              <w:rPr>
+                <w:sz w:val="20"/>
+              </w:rPr>
+              <w:t>Historical profit contribution</w:t>
+            </w:r>
+          </w:p>
+        </w:tc>
+        <w:tc>
+          <w:tcPr>
+            <w:tcW w:type="dxa" w:w="2946"/>
+            <w:shd w:val="clear" w:color="auto" w:fill="FFFFFF"/>
+          </w:tcPr>
+          <w:p>
+            <w:pPr>
+              <w:jc w:val="center"/>
+            </w:pPr>
+            <w:r>
+              <w:rPr>
+                <w:sz w:val="20"/>
+              </w:rPr>
+              <w:t>15%</w:t>
+            </w:r>
+          </w:p>
+        </w:tc>
+        <w:tc>
+          <w:tcPr>
+            <w:tcW w:type="dxa" w:w="2946"/>
+            <w:shd w:val="clear" w:color="auto" w:fill="FFFFFF"/>
+          </w:tcPr>
+          <w:p>
+            <w:pPr>
+              <w:jc w:val="center"/>
+            </w:pPr>
+            <w:r>
+              <w:rPr>
+                <w:sz w:val="20"/>
+              </w:rPr>
+              <w:t>Customers who have been profitable in the past are more valuable to retain</w:t>
+            </w:r>
+          </w:p>
+        </w:tc>
+      </w:tr>
+    </w:tbl>
+    <w:p>
+      <w:pPr>
+        <w:spacing w:after="160"/>
+      </w:pPr>
+    </w:p>
+    <w:p>
+      <w:pPr>
+        <w:spacing w:before="0" w:after="120"/>
+      </w:pPr>
+      <w:r>
+        <w:rPr>
+          <w:color w:val="333333"/>
+          <w:sz w:val="21"/>
+        </w:rPr>
+        <w:t>Rather than combining these as raw numbers (which would let one measure dominate because of its units), each is converted to a 0–100 percentile rank first, then blended. The resulting composite score is then split into four groups — Excellent, Good, Fair, Poor — by letting the data find its own natural breakpoints (a statistical technique called K-Means clustering). This means the boundaries adapt to our actual portfolio rather than being set by arbitrary thresholds.</w:t>
+      </w:r>
+    </w:p>
+    <w:tbl>
+      <w:tblPr>
+        <w:tblStyle w:val="TableGrid"/>
+        <w:tblW w:type="auto" w:w="0"/>
+        <w:tblLook w:firstColumn="1" w:firstRow="1" w:lastColumn="0" w:lastRow="0" w:noHBand="0" w:noVBand="1" w:val="04A0"/>
+      </w:tblPr>
+      <w:tblGrid>
+        <w:gridCol w:w="8838"/>
+      </w:tblGrid>
+      <w:tr>
+        <w:tc>
+          <w:tcPr>
+            <w:tcW w:type="dxa" w:w="8838"/>
+            <w:shd w:val="clear" w:color="auto" w:fill="EBF5FB"/>
+          </w:tcPr>
+          <w:p/>
+          <w:p>
+            <w:pPr>
+              <w:spacing w:before="80" w:after="80"/>
+            </w:pPr>
+            <w:r>
+              <w:rPr>
+                <w:b/>
+                <w:color w:val="007A8A"/>
+                <w:sz w:val="18"/>
+              </w:rPr>
+              <w:t xml:space="preserve">DESIGN CHOICE  |  </w:t>
+            </w:r>
+            <w:r>
+              <w:rPr>
+                <w:color w:val="333333"/>
+                <w:sz w:val="21"/>
+              </w:rPr>
+              <w:t>These weights are not invented — they mirror the FICO scoring framework, which is backed by decades of consumer credit research. Borrowing validated weights avoids overfitting our small dataset.</w:t>
+            </w:r>
+          </w:p>
+        </w:tc>
+      </w:tr>
+    </w:tbl>
+    <w:p>
+      <w:pPr>
+        <w:spacing w:after="80"/>
+      </w:pPr>
+    </w:p>
+    <w:p>
+      <w:pPr>
+        <w:spacing w:after="80"/>
+      </w:pPr>
+    </w:p>
+    <w:p>
+      <w:pPr>
+        <w:spacing w:before="200" w:after="60"/>
+      </w:pPr>
+      <w:r>
+        <w:rPr>
+          <w:b/>
+          <w:color w:val="007A8A"/>
+          <w:sz w:val="23"/>
+        </w:rPr>
+        <w:t>How the economy changes what we offer</w:t>
+      </w:r>
+    </w:p>
+    <w:p>
+      <w:pPr>
+        <w:spacing w:before="0" w:after="120"/>
+      </w:pPr>
+      <w:r>
+        <w:rPr>
+          <w:color w:val="333333"/>
+          <w:sz w:val="21"/>
+        </w:rPr>
+        <w:t>Two economic variables adjust the model's behaviour before any customer-level calculation runs:</w:t>
+      </w:r>
+    </w:p>
+    <w:tbl>
+      <w:tblPr>
+        <w:tblStyle w:val="TableGrid"/>
+        <w:tblW w:type="auto" w:w="0"/>
+        <w:jc w:val="center"/>
+        <w:tblLook w:firstColumn="1" w:firstRow="1" w:lastColumn="0" w:lastRow="0" w:noHBand="0" w:noVBand="1" w:val="04A0"/>
+      </w:tblPr>
+      <w:tblGrid>
+        <w:gridCol w:w="2209"/>
+        <w:gridCol w:w="2209"/>
+        <w:gridCol w:w="2209"/>
+        <w:gridCol w:w="2209"/>
+      </w:tblGrid>
+      <w:tr>
+        <w:tc>
+          <w:tcPr>
+            <w:tcW w:type="dxa" w:w="2209"/>
+            <w:shd w:val="clear" w:color="auto" w:fill="1A4A6B"/>
+          </w:tcPr>
+          <w:p>
+            <w:pPr>
+              <w:jc w:val="center"/>
+            </w:pPr>
+            <w:r>
+              <w:rPr>
+                <w:b/>
+                <w:color w:val="FFFFFF"/>
+                <w:sz w:val="20"/>
+              </w:rPr>
+              <w:t>Economic signal</w:t>
+            </w:r>
+          </w:p>
+        </w:tc>
+        <w:tc>
+          <w:tcPr>
+            <w:tcW w:type="dxa" w:w="2209"/>
+            <w:shd w:val="clear" w:color="auto" w:fill="1A4A6B"/>
+          </w:tcPr>
+          <w:p>
+            <w:pPr>
+              <w:jc w:val="center"/>
+            </w:pPr>
+            <w:r>
+              <w:rPr>
+                <w:b/>
+                <w:color w:val="FFFFFF"/>
+                <w:sz w:val="20"/>
+              </w:rPr>
+              <w:t>Effect on model</w:t>
+            </w:r>
+          </w:p>
+        </w:tc>
+        <w:tc>
+          <w:tcPr>
+            <w:tcW w:type="dxa" w:w="2209"/>
+            <w:shd w:val="clear" w:color="auto" w:fill="1A4A6B"/>
+          </w:tcPr>
+          <w:p>
+            <w:pPr>
+              <w:jc w:val="center"/>
+            </w:pPr>
+            <w:r>
+              <w:rPr>
+                <w:b/>
+                <w:color w:val="FFFFFF"/>
+                <w:sz w:val="20"/>
+              </w:rPr>
+              <w:t>Direction</w:t>
+            </w:r>
+          </w:p>
+        </w:tc>
+        <w:tc>
+          <w:tcPr>
+            <w:tcW w:type="dxa" w:w="2209"/>
+            <w:shd w:val="clear" w:color="auto" w:fill="1A4A6B"/>
+          </w:tcPr>
+          <w:p>
+            <w:pPr>
+              <w:jc w:val="center"/>
+            </w:pPr>
+            <w:r>
+              <w:rPr>
+                <w:b/>
+                <w:color w:val="FFFFFF"/>
+                <w:sz w:val="20"/>
+              </w:rPr>
+              <w:t>Why</w:t>
+            </w:r>
+          </w:p>
+        </w:tc>
+      </w:tr>
+      <w:tr>
+        <w:tc>
+          <w:tcPr>
+            <w:tcW w:type="dxa" w:w="2209"/>
+            <w:shd w:val="clear" w:color="auto" w:fill="E8F4F8"/>
+          </w:tcPr>
+          <w:p>
+            <w:pPr>
+              <w:jc w:val="center"/>
+            </w:pPr>
+            <w:r>
+              <w:rPr>
+                <w:sz w:val="20"/>
+              </w:rPr>
+              <w:t>Unemployment rate</w:t>
+            </w:r>
+          </w:p>
+        </w:tc>
+        <w:tc>
+          <w:tcPr>
+            <w:tcW w:type="dxa" w:w="2209"/>
+            <w:shd w:val="clear" w:color="auto" w:fill="E8F4F8"/>
+          </w:tcPr>
+          <w:p>
+            <w:pPr>
+              <w:jc w:val="center"/>
+            </w:pPr>
+            <w:r>
+              <w:rPr>
+                <w:sz w:val="20"/>
+              </w:rPr>
+              <w:t>Raises estimated default rates</w:t>
+            </w:r>
+          </w:p>
+        </w:tc>
+        <w:tc>
+          <w:tcPr>
+            <w:tcW w:type="dxa" w:w="2209"/>
+            <w:shd w:val="clear" w:color="auto" w:fill="E8F4F8"/>
+          </w:tcPr>
+          <w:p>
+            <w:pPr>
+              <w:jc w:val="center"/>
+            </w:pPr>
+            <w:r>
+              <w:rPr>
+                <w:sz w:val="20"/>
+              </w:rPr>
+              <w:t>+1pp unemployment → +1pp default risk</w:t>
+            </w:r>
+          </w:p>
+        </w:tc>
+        <w:tc>
+          <w:tcPr>
+            <w:tcW w:type="dxa" w:w="2209"/>
+            <w:shd w:val="clear" w:color="auto" w:fill="E8F4F8"/>
+          </w:tcPr>
+          <w:p>
+            <w:pPr>
+              <w:jc w:val="center"/>
+            </w:pPr>
+            <w:r>
+              <w:rPr>
+                <w:sz w:val="20"/>
+              </w:rPr>
+              <w:t>Job losses are the #1 cause of consumer loan defaults — if more people are unemployed, our customers are statistically more likely to miss payments</w:t>
+            </w:r>
+          </w:p>
+        </w:tc>
+      </w:tr>
+      <w:tr>
+        <w:tc>
+          <w:tcPr>
+            <w:tcW w:type="dxa" w:w="2209"/>
+            <w:shd w:val="clear" w:color="auto" w:fill="FFFFFF"/>
+          </w:tcPr>
+          <w:p>
+            <w:pPr>
+              <w:jc w:val="center"/>
+            </w:pPr>
+            <w:r>
+              <w:rPr>
+                <w:sz w:val="20"/>
+              </w:rPr>
+              <w:t>Central bank rate (Fed rate)</w:t>
+            </w:r>
+          </w:p>
+        </w:tc>
+        <w:tc>
+          <w:tcPr>
+            <w:tcW w:type="dxa" w:w="2209"/>
+            <w:shd w:val="clear" w:color="auto" w:fill="FFFFFF"/>
+          </w:tcPr>
+          <w:p>
+            <w:pPr>
+              <w:jc w:val="center"/>
+            </w:pPr>
+            <w:r>
+              <w:rPr>
+                <w:sz w:val="20"/>
+              </w:rPr>
+              <w:t>Raises estimated default rates (smaller effect)</w:t>
+            </w:r>
+          </w:p>
+        </w:tc>
+        <w:tc>
+          <w:tcPr>
+            <w:tcW w:type="dxa" w:w="2209"/>
+            <w:shd w:val="clear" w:color="auto" w:fill="FFFFFF"/>
+          </w:tcPr>
+          <w:p>
+            <w:pPr>
+              <w:jc w:val="center"/>
+            </w:pPr>
+            <w:r>
+              <w:rPr>
+                <w:sz w:val="20"/>
+              </w:rPr>
+              <w:t>+1pp rate → +0.5pp default risk</w:t>
+            </w:r>
+          </w:p>
+        </w:tc>
+        <w:tc>
+          <w:tcPr>
+            <w:tcW w:type="dxa" w:w="2209"/>
+            <w:shd w:val="clear" w:color="auto" w:fill="FFFFFF"/>
+          </w:tcPr>
+          <w:p>
+            <w:pPr>
+              <w:jc w:val="center"/>
+            </w:pPr>
+            <w:r>
+              <w:rPr>
+                <w:sz w:val="20"/>
+              </w:rPr>
+              <w:t>Higher interest rates make it harder for customers with variable-rate debt to refinance — indirect pressure on repayment capacity</w:t>
+            </w:r>
+          </w:p>
+        </w:tc>
+      </w:tr>
+      <w:tr>
+        <w:tc>
+          <w:tcPr>
+            <w:tcW w:type="dxa" w:w="2209"/>
+            <w:shd w:val="clear" w:color="auto" w:fill="E8F4F8"/>
+          </w:tcPr>
+          <w:p>
+            <w:pPr>
+              <w:jc w:val="center"/>
+            </w:pPr>
+            <w:r>
+              <w:rPr>
+                <w:sz w:val="20"/>
+              </w:rPr>
+              <w:t>GDP growth</w:t>
+            </w:r>
+          </w:p>
+        </w:tc>
+        <w:tc>
+          <w:tcPr>
+            <w:tcW w:type="dxa" w:w="2209"/>
+            <w:shd w:val="clear" w:color="auto" w:fill="E8F4F8"/>
+          </w:tcPr>
+          <w:p>
+            <w:pPr>
+              <w:jc w:val="center"/>
+            </w:pPr>
+            <w:r>
+              <w:rPr>
+                <w:sz w:val="20"/>
+              </w:rPr>
+              <w:t>Adjusts the length of extension offered</w:t>
+            </w:r>
+          </w:p>
+        </w:tc>
+        <w:tc>
+          <w:tcPr>
+            <w:tcW w:type="dxa" w:w="2209"/>
+            <w:shd w:val="clear" w:color="auto" w:fill="E8F4F8"/>
+          </w:tcPr>
+          <w:p>
+            <w:pPr>
+              <w:jc w:val="center"/>
+            </w:pPr>
+            <w:r>
+              <w:rPr>
+                <w:sz w:val="20"/>
+              </w:rPr>
+              <w:t>+1pp GDP → +10 extra days offered</w:t>
+            </w:r>
+          </w:p>
+        </w:tc>
+        <w:tc>
+          <w:tcPr>
+            <w:tcW w:type="dxa" w:w="2209"/>
+            <w:shd w:val="clear" w:color="auto" w:fill="E8F4F8"/>
+          </w:tcPr>
+          <w:p>
+            <w:pPr>
+              <w:jc w:val="center"/>
+            </w:pPr>
+            <w:r>
+              <w:rPr>
+                <w:sz w:val="20"/>
+              </w:rPr>
+              <w:t>In a growing economy we can afford to offer longer extensions; in a downturn we shorten them to limit how long we stay exposed</w:t>
+            </w:r>
+          </w:p>
+        </w:tc>
+      </w:tr>
+    </w:tbl>
+    <w:p>
+      <w:pPr>
+        <w:spacing w:after="160"/>
+      </w:pPr>
+    </w:p>
+    <w:p>
+      <w:pPr>
+        <w:spacing w:before="0" w:after="120"/>
+      </w:pPr>
+      <w:r>
+        <w:rPr>
+          <w:color w:val="333333"/>
+          <w:sz w:val="21"/>
+        </w:rPr>
+        <w:t>At 2023 baseline levels (unemployment 4%, Fed rate 5%, GDP growth 2.5%) these adjustments are all zero — no change. They only shift results when running the Optimistic or Adverse scenarios in Section 4.</w:t>
+      </w:r>
+    </w:p>
+    <w:p>
+      <w:pPr>
+        <w:spacing w:before="200" w:after="60"/>
+      </w:pPr>
+      <w:r>
+        <w:rPr>
+          <w:b/>
+          <w:color w:val="007A8A"/>
+          <w:sz w:val="23"/>
+        </w:rPr>
+        <w:t>How 3,500 futures are simulated per customer</w:t>
+      </w:r>
+    </w:p>
+    <w:p>
+      <w:pPr>
+        <w:spacing w:before="0" w:after="120"/>
+      </w:pPr>
+      <w:r>
+        <w:rPr>
+          <w:color w:val="333333"/>
+          <w:sz w:val="21"/>
+        </w:rPr>
+        <w:t>The Monte Carlo simulation runs 3,500 imaginary futures for each customer. Think of it like rolling dice 3,500 times to find the average outcome, rather than guessing based on a single roll. Each future draws a random extension length and a random repayment outcome, then computes the resulting profit or loss. The 3,500 results are averaged to give a stable estimate that isn't thrown off by any single unlucky or lucky scenario.</w:t>
+      </w:r>
+    </w:p>
+    <w:p>
+      <w:pPr>
+        <w:spacing w:before="200" w:after="60"/>
+      </w:pPr>
+      <w:r>
+        <w:rPr>
+          <w:b/>
+          <w:color w:val="007A8A"/>
+          <w:sz w:val="23"/>
+        </w:rPr>
+        <w:t>Assumption: how long the extension lasts</w:t>
+      </w:r>
+    </w:p>
+    <w:p>
+      <w:pPr>
+        <w:spacing w:before="0" w:after="120"/>
+      </w:pPr>
+      <w:r>
+        <w:rPr>
+          <w:color w:val="333333"/>
+          <w:sz w:val="21"/>
+        </w:rPr>
+        <w:t>Each customer's extension term is drawn from a right-skewed distribution — most customers use close to the typical term for their credit tier, but a small number take significantly longer. The distribution is anchored to state-specific averages (Excellent: 90 days, Good: 75, Fair: 60, Poor: 45) and is capped between 30 and 180 days as a hard policy boundary.</w:t>
+      </w:r>
+    </w:p>
+    <w:p>
+      <w:pPr>
+        <w:spacing w:before="0" w:after="120"/>
+      </w:pPr>
+      <w:r>
+        <w:rPr>
+          <w:color w:val="333333"/>
+          <w:sz w:val="21"/>
+        </w:rPr>
+        <w:t>Why right-skewed? Because repayment timing in the real world is not symmetrical — a customer can repay a few days early but can be weeks or months late. The distribution shape captures that asymmetry.</w:t>
+      </w:r>
+    </w:p>
+    <w:p>
+      <w:pPr>
+        <w:spacing w:before="0" w:after="120"/>
+      </w:pPr>
+      <w:r>
+        <w:rPr>
+          <w:color w:val="333333"/>
+          <w:sz w:val="21"/>
+        </w:rPr>
+        <w:t>What this assumes: that the average and spread of extension terms for our customers follow these patterns. If real portfolio data shows different typical terms by segment, these should be updated.</w:t>
+      </w:r>
+    </w:p>
+    <w:p>
+      <w:pPr>
+        <w:spacing w:before="200" w:after="60"/>
+      </w:pPr>
+      <w:r>
+        <w:rPr>
+          <w:b/>
+          <w:color w:val="007A8A"/>
+          <w:sz w:val="23"/>
+        </w:rPr>
+        <w:t>Assumption: how default risk grows with time</w:t>
+      </w:r>
+    </w:p>
+    <w:p>
+      <w:pPr>
+        <w:spacing w:before="0" w:after="120"/>
+      </w:pPr>
+      <w:r>
+        <w:rPr>
+          <w:color w:val="333333"/>
+          <w:sz w:val="21"/>
+        </w:rPr>
+        <w:t>The model assumes that a customer's chance of defaulting increases steadily with each extra day of exposure — like a constant drip of risk. Mathematically this is called a 'constant hazard rate'. It means a 60-day extension carries roughly twice the default risk of a 30-day extension for the same customer.</w:t>
+      </w:r>
+    </w:p>
+    <w:p>
+      <w:pPr>
+        <w:spacing w:before="0" w:after="120"/>
+      </w:pPr>
+      <w:r>
+        <w:rPr>
+          <w:color w:val="333333"/>
+          <w:sz w:val="21"/>
+        </w:rPr>
+        <w:t>This is conservative. In practice, customers who survive the first few weeks of an extension tend to be self-selecting good payers — the riskiest customers default early. Assuming a constant rate slightly overstates long-term default risk, which makes the model err on the side of caution.</w:t>
+      </w:r>
+    </w:p>
+    <w:p>
+      <w:pPr>
+        <w:spacing w:before="0" w:after="120"/>
+      </w:pPr>
+      <w:r>
+        <w:rPr>
+          <w:color w:val="333333"/>
+          <w:sz w:val="21"/>
+        </w:rPr>
+        <w:t>What this assumes: that the risk clock ticks at the same speed for the full extension period, with no 'seasoning' effect. A more sophisticated model would allow the hazard rate to fall over time as high-risk customers are weeded out.</w:t>
+      </w:r>
+    </w:p>
+    <w:p>
+      <w:pPr>
+        <w:spacing w:before="200" w:after="60"/>
+      </w:pPr>
+      <w:r>
+        <w:rPr>
+          <w:b/>
+          <w:color w:val="007A8A"/>
+          <w:sz w:val="23"/>
+        </w:rPr>
+        <w:t>Assumption: three outcomes are mutually exclusive</w:t>
+      </w:r>
+    </w:p>
+    <w:p>
+      <w:pPr>
+        <w:spacing w:before="0" w:after="120"/>
+      </w:pPr>
+      <w:r>
+        <w:rPr>
+          <w:color w:val="333333"/>
+          <w:sz w:val="21"/>
+        </w:rPr>
+        <w:t>For each simulated future, exactly one of three things happens — and the model treats them as a strict sequence of decisions:</w:t>
+      </w:r>
+    </w:p>
+    <w:tbl>
+      <w:tblPr>
+        <w:tblStyle w:val="TableGrid"/>
+        <w:tblW w:type="auto" w:w="0"/>
+        <w:jc w:val="center"/>
+        <w:tblLook w:firstColumn="1" w:firstRow="1" w:lastColumn="0" w:lastRow="0" w:noHBand="0" w:noVBand="1" w:val="04A0"/>
+      </w:tblPr>
+      <w:tblGrid>
+        <w:gridCol w:w="2209"/>
+        <w:gridCol w:w="2209"/>
+        <w:gridCol w:w="2209"/>
+        <w:gridCol w:w="2209"/>
+      </w:tblGrid>
+      <w:tr>
+        <w:tc>
+          <w:tcPr>
+            <w:tcW w:type="dxa" w:w="2209"/>
+            <w:shd w:val="clear" w:color="auto" w:fill="1A4A6B"/>
+          </w:tcPr>
+          <w:p>
+            <w:pPr>
+              <w:jc w:val="center"/>
+            </w:pPr>
+            <w:r>
+              <w:rPr>
+                <w:b/>
+                <w:color w:val="FFFFFF"/>
+                <w:sz w:val="20"/>
+              </w:rPr>
+              <w:t>Outcome</w:t>
+            </w:r>
+          </w:p>
+        </w:tc>
+        <w:tc>
+          <w:tcPr>
+            <w:tcW w:type="dxa" w:w="2209"/>
+            <w:shd w:val="clear" w:color="auto" w:fill="1A4A6B"/>
+          </w:tcPr>
+          <w:p>
+            <w:pPr>
+              <w:jc w:val="center"/>
+            </w:pPr>
+            <w:r>
+              <w:rPr>
+                <w:b/>
+                <w:color w:val="FFFFFF"/>
+                <w:sz w:val="20"/>
+              </w:rPr>
+              <w:t>Probability</w:t>
+            </w:r>
+          </w:p>
+        </w:tc>
+        <w:tc>
+          <w:tcPr>
+            <w:tcW w:type="dxa" w:w="2209"/>
+            <w:shd w:val="clear" w:color="auto" w:fill="1A4A6B"/>
+          </w:tcPr>
+          <w:p>
+            <w:pPr>
+              <w:jc w:val="center"/>
+            </w:pPr>
+            <w:r>
+              <w:rPr>
+                <w:b/>
+                <w:color w:val="FFFFFF"/>
+                <w:sz w:val="20"/>
+              </w:rPr>
+              <w:t>Revenue impact</w:t>
+            </w:r>
+          </w:p>
+        </w:tc>
+        <w:tc>
+          <w:tcPr>
+            <w:tcW w:type="dxa" w:w="2209"/>
+            <w:shd w:val="clear" w:color="auto" w:fill="1A4A6B"/>
+          </w:tcPr>
+          <w:p>
+            <w:pPr>
+              <w:jc w:val="center"/>
+            </w:pPr>
+            <w:r>
+              <w:rPr>
+                <w:b/>
+                <w:color w:val="FFFFFF"/>
+                <w:sz w:val="20"/>
+              </w:rPr>
+              <w:t>Loss impact</w:t>
+            </w:r>
+          </w:p>
+        </w:tc>
+      </w:tr>
+      <w:tr>
+        <w:tc>
+          <w:tcPr>
+            <w:tcW w:type="dxa" w:w="2209"/>
+            <w:shd w:val="clear" w:color="auto" w:fill="E8F4F8"/>
+          </w:tcPr>
+          <w:p>
+            <w:pPr>
+              <w:jc w:val="center"/>
+            </w:pPr>
+            <w:r>
+              <w:rPr>
+                <w:sz w:val="20"/>
+              </w:rPr>
+              <w:t>Customer repays early</w:t>
+            </w:r>
+          </w:p>
+        </w:tc>
+        <w:tc>
+          <w:tcPr>
+            <w:tcW w:type="dxa" w:w="2209"/>
+            <w:shd w:val="clear" w:color="auto" w:fill="E8F4F8"/>
+          </w:tcPr>
+          <w:p>
+            <w:pPr>
+              <w:jc w:val="center"/>
+            </w:pPr>
+            <w:r>
+              <w:rPr>
+                <w:sz w:val="20"/>
+              </w:rPr>
+              <w:t>5%–25% depending on tier</w:t>
+            </w:r>
+          </w:p>
+        </w:tc>
+        <w:tc>
+          <w:tcPr>
+            <w:tcW w:type="dxa" w:w="2209"/>
+            <w:shd w:val="clear" w:color="auto" w:fill="E8F4F8"/>
+          </w:tcPr>
+          <w:p>
+            <w:pPr>
+              <w:jc w:val="center"/>
+            </w:pPr>
+            <w:r>
+              <w:rPr>
+                <w:sz w:val="20"/>
+              </w:rPr>
+              <w:t>$40 fee (slightly reduced by time-value)</w:t>
+            </w:r>
+          </w:p>
+        </w:tc>
+        <w:tc>
+          <w:tcPr>
+            <w:tcW w:type="dxa" w:w="2209"/>
+            <w:shd w:val="clear" w:color="auto" w:fill="E8F4F8"/>
+          </w:tcPr>
+          <w:p>
+            <w:pPr>
+              <w:jc w:val="center"/>
+            </w:pPr>
+            <w:r>
+              <w:rPr>
+                <w:sz w:val="20"/>
+              </w:rPr>
+              <w:t>None</w:t>
+            </w:r>
+          </w:p>
+        </w:tc>
+      </w:tr>
+      <w:tr>
+        <w:tc>
+          <w:tcPr>
+            <w:tcW w:type="dxa" w:w="2209"/>
+            <w:shd w:val="clear" w:color="auto" w:fill="FFFFFF"/>
+          </w:tcPr>
+          <w:p>
+            <w:pPr>
+              <w:jc w:val="center"/>
+            </w:pPr>
+            <w:r>
+              <w:rPr>
+                <w:sz w:val="20"/>
+              </w:rPr>
+              <w:t>Customer repays on time</w:t>
+            </w:r>
+          </w:p>
+        </w:tc>
+        <w:tc>
+          <w:tcPr>
+            <w:tcW w:type="dxa" w:w="2209"/>
+            <w:shd w:val="clear" w:color="auto" w:fill="FFFFFF"/>
+          </w:tcPr>
+          <w:p>
+            <w:pPr>
+              <w:jc w:val="center"/>
+            </w:pPr>
+            <w:r>
+              <w:rPr>
+                <w:sz w:val="20"/>
+              </w:rPr>
+              <w:t>Residual (largest group)</w:t>
+            </w:r>
+          </w:p>
+        </w:tc>
+        <w:tc>
+          <w:tcPr>
+            <w:tcW w:type="dxa" w:w="2209"/>
+            <w:shd w:val="clear" w:color="auto" w:fill="FFFFFF"/>
+          </w:tcPr>
+          <w:p>
+            <w:pPr>
+              <w:jc w:val="center"/>
+            </w:pPr>
+            <w:r>
+              <w:rPr>
+                <w:sz w:val="20"/>
+              </w:rPr>
+              <w:t>$40 fee (slightly reduced by time-value)</w:t>
+            </w:r>
+          </w:p>
+        </w:tc>
+        <w:tc>
+          <w:tcPr>
+            <w:tcW w:type="dxa" w:w="2209"/>
+            <w:shd w:val="clear" w:color="auto" w:fill="FFFFFF"/>
+          </w:tcPr>
+          <w:p>
+            <w:pPr>
+              <w:jc w:val="center"/>
+            </w:pPr>
+            <w:r>
+              <w:rPr>
+                <w:sz w:val="20"/>
+              </w:rPr>
+              <w:t>None</w:t>
+            </w:r>
+          </w:p>
+        </w:tc>
+      </w:tr>
+      <w:tr>
+        <w:tc>
+          <w:tcPr>
+            <w:tcW w:type="dxa" w:w="2209"/>
+            <w:shd w:val="clear" w:color="auto" w:fill="E8F4F8"/>
+          </w:tcPr>
+          <w:p>
+            <w:pPr>
+              <w:jc w:val="center"/>
+            </w:pPr>
+            <w:r>
+              <w:rPr>
+                <w:sz w:val="20"/>
+              </w:rPr>
+              <w:t>Customer defaults</w:t>
+            </w:r>
+          </w:p>
+        </w:tc>
+        <w:tc>
+          <w:tcPr>
+            <w:tcW w:type="dxa" w:w="2209"/>
+            <w:shd w:val="clear" w:color="auto" w:fill="E8F4F8"/>
+          </w:tcPr>
+          <w:p>
+            <w:pPr>
+              <w:jc w:val="center"/>
+            </w:pPr>
+            <w:r>
+              <w:rPr>
+                <w:sz w:val="20"/>
+              </w:rPr>
+              <w:t>Ranges from &lt;1% to ~2% per simulation</w:t>
+            </w:r>
+          </w:p>
+        </w:tc>
+        <w:tc>
+          <w:tcPr>
+            <w:tcW w:type="dxa" w:w="2209"/>
+            <w:shd w:val="clear" w:color="auto" w:fill="E8F4F8"/>
+          </w:tcPr>
+          <w:p>
+            <w:pPr>
+              <w:jc w:val="center"/>
+            </w:pPr>
+            <w:r>
+              <w:rPr>
+                <w:sz w:val="20"/>
+              </w:rPr>
+              <w:t>$40 fee (already collected)</w:t>
+            </w:r>
+          </w:p>
+        </w:tc>
+        <w:tc>
+          <w:tcPr>
+            <w:tcW w:type="dxa" w:w="2209"/>
+            <w:shd w:val="clear" w:color="auto" w:fill="E8F4F8"/>
+          </w:tcPr>
+          <w:p>
+            <w:pPr>
+              <w:jc w:val="center"/>
+            </w:pPr>
+            <w:r>
+              <w:rPr>
+                <w:sz w:val="20"/>
+              </w:rPr>
+              <w:t>Full loan balance × 60% loss rate</w:t>
+            </w:r>
+          </w:p>
+        </w:tc>
+      </w:tr>
+    </w:tbl>
+    <w:p>
+      <w:pPr>
+        <w:spacing w:after="160"/>
+      </w:pPr>
+    </w:p>
+    <w:p>
+      <w:pPr>
+        <w:spacing w:before="0" w:after="120"/>
+      </w:pPr>
+      <w:r>
+        <w:rPr>
+          <w:color w:val="333333"/>
+          <w:sz w:val="21"/>
+        </w:rPr>
+        <w:t>A customer who repays early cannot later default — the model enforces this by checking early repayment first, then checking for default only among those who did not repay early. This matches reality: once money is repaid, the credit risk is extinguished.</w:t>
+      </w:r>
+    </w:p>
+    <w:p>
+      <w:pPr>
+        <w:spacing w:before="200" w:after="60"/>
+      </w:pPr>
+      <w:r>
+        <w:rPr>
+          <w:b/>
+          <w:color w:val="007A8A"/>
+          <w:sz w:val="23"/>
+        </w:rPr>
+        <w:t>Assumption: revenue is a flat $40 fee per extension</w:t>
+      </w:r>
+    </w:p>
+    <w:p>
+      <w:pPr>
+        <w:spacing w:before="0" w:after="120"/>
+      </w:pPr>
+      <w:r>
+        <w:rPr>
+          <w:color w:val="333333"/>
+          <w:sz w:val="21"/>
+        </w:rPr>
+        <w:t>All revenue from granting a term extension is modelled as a single $40 relationship fee, earned at the moment the extension is approved. This fee is then lightly adjusted downward to reflect the time-value of money — a 30-day extension is worth slightly less than a 90-day extension in present-value terms, so the fee is scaled proportionally.</w:t>
+      </w:r>
+    </w:p>
+    <w:p>
+      <w:pPr>
+        <w:spacing w:before="0" w:after="120"/>
+      </w:pPr>
+      <w:r>
+        <w:rPr>
+          <w:color w:val="333333"/>
+          <w:sz w:val="21"/>
+        </w:rPr>
+        <w:t>What this assumes: that the fee is flat and does not vary by loan size, customer segment, or term length. If the actual fee structure is different (percentage-based, tiered, or negotiated), the profit figures in this report should be recalculated. The flat-fee structure also means large loans and small loans produce the same revenue — but large loans carry proportionally more loss risk. This asymmetry is why the largest Poor-segment loans are denied.</w:t>
+      </w:r>
+    </w:p>
+    <w:p>
+      <w:pPr>
+        <w:spacing w:before="200" w:after="60"/>
+      </w:pPr>
+      <w:r>
+        <w:rPr>
+          <w:b/>
+          <w:color w:val="007A8A"/>
+          <w:sz w:val="23"/>
+        </w:rPr>
+        <w:t>Assumption: if a customer defaults, we lose the full loan balance</w:t>
+      </w:r>
+    </w:p>
+    <w:p>
+      <w:pPr>
+        <w:spacing w:before="0" w:after="120"/>
+      </w:pPr>
+      <w:r>
+        <w:rPr>
+          <w:color w:val="333333"/>
+          <w:sz w:val="21"/>
+        </w:rPr>
+        <w:t>When a customer defaults during the extension period, the model assumes we lose 60% of the outstanding loan balance (the remaining 40% is expected to be recovered through collections). This 60% figure — called the Loss Given Default — is the industry standard for unsecured consumer loans.</w:t>
+      </w:r>
+    </w:p>
+    <w:p>
+      <w:pPr>
+        <w:spacing w:before="0" w:after="120"/>
+      </w:pPr>
+      <w:r>
+        <w:rPr>
+          <w:color w:val="333333"/>
+          <w:sz w:val="21"/>
+        </w:rPr>
+        <w:t>Importantly, the loss is calculated on the full loan balance, not just the extension itself. This is correct because a term extension does not reduce what the customer owes — we are simply giving them more time. If they fail to repay, we lose the entire outstanding amount, not a fraction of it.</w:t>
+      </w:r>
+    </w:p>
+    <w:p>
+      <w:pPr>
+        <w:spacing w:before="0" w:after="120"/>
+      </w:pPr>
+      <w:r>
+        <w:rPr>
+          <w:color w:val="333333"/>
+          <w:sz w:val="21"/>
+        </w:rPr>
+        <w:t>This is the key difference from a credit limit increase model: there, the extra risk comes only from the additional borrowing. Here, the risk is on the entire pre-existing balance being exposed for longer.</w:t>
+      </w:r>
+    </w:p>
+    <w:p>
+      <w:pPr>
+        <w:spacing w:before="200" w:after="60"/>
+      </w:pPr>
+      <w:r>
+        <w:rPr>
+          <w:b/>
+          <w:color w:val="007A8A"/>
+          <w:sz w:val="23"/>
+        </w:rPr>
+        <w:t>Assumption: customers behave independently of each other</w:t>
+      </w:r>
+    </w:p>
+    <w:p>
+      <w:pPr>
+        <w:spacing w:before="0" w:after="120"/>
+      </w:pPr>
+      <w:r>
+        <w:rPr>
+          <w:color w:val="333333"/>
+          <w:sz w:val="21"/>
+        </w:rPr>
+        <w:t>The simulation treats each customer's outcome as independent — one customer defaulting does not make another more likely to default. In a stable economy this is a reasonable approximation.</w:t>
+      </w:r>
+    </w:p>
+    <w:p>
+      <w:pPr>
+        <w:spacing w:before="0" w:after="120"/>
+      </w:pPr>
+      <w:r>
+        <w:rPr>
+          <w:color w:val="333333"/>
+          <w:sz w:val="21"/>
+        </w:rPr>
+        <w:t>The limitation: during a genuine economic shock (a sudden recession, a sector collapse), defaults cluster together — many customers default at the same time for the same external reason. The model captures this at a high level through the macro adjustment to default rates, but does not model the full 'domino effect' of correlated defaults. The Adverse scenario stress test is the practical safeguard against this risk.</w:t>
+      </w:r>
+    </w:p>
+    <w:p>
+      <w:pPr>
+        <w:spacing w:after="80"/>
+      </w:pPr>
+    </w:p>
+    <w:p>
+      <w:pPr>
+        <w:spacing w:before="320" w:after="80"/>
+      </w:pPr>
+      <w:r>
+        <w:rPr>
+          <w:b/>
+          <w:color w:val="1A1A2E"/>
+          <w:sz w:val="28"/>
+        </w:rPr>
+        <w:t>7.  How to Use These Recommendations</w:t>
       </w:r>
     </w:p>
     <w:p>
@@ -3887,7 +5226,7 @@
           <w:color w:val="1A1A2E"/>
           <w:sz w:val="28"/>
         </w:rPr>
-        <w:t>7.  Technical Quality and Validation</w:t>
+        <w:t>8.  Technical Quality and Validation</w:t>
       </w:r>
     </w:p>
     <w:p>

</xml_diff>

<commit_message>
Update explainer with latest results and model improvements section
- Updated all figures: 23,740 granted, $654,196 profit, 45/45 tests
- Sensitivity table now shows all three scenarios with actual numbers
  (granted, profit, portfolio risk, risk cap) including adverse cap at 4.5%
- New Section 7: plain-English summary of all 7 model improvements
  (risk_rank clustering, vectorised MC, uptake-weighted LP, sensitivity fix,
   centralised macro constants, 12 charts, 45 property tests)
- Sections renumbered: improvements → 7, how-to-use → 8, quality → 9

Co-Authored-By: Claude Sonnet 4.6 <noreply@anthropic.com>
</commit_message>
<xml_diff>
--- a/submission/Term_Extension_Optimisation_Explainer.docx
+++ b/submission/Term_Extension_Optimisation_Explainer.docx
@@ -110,7 +110,7 @@
                 <w:color w:val="333333"/>
                 <w:sz w:val="21"/>
               </w:rPr>
-              <w:t>Out of 30,000 customers assessed, 23,713 (79%) are recommended for a term extension. The programme is expected to generate $654K in net profit at a portfolio default risk of just 0.90% — well below our 5% safety cap.</w:t>
+              <w:t>Out of 30,000 customers assessed, 23,740 (79.1%) are recommended for a term extension. The programme is expected to generate $654K in net profit at a portfolio default risk of just 0.90% — well below our 5% safety cap. 45 out of 45 automated model checks pass.</w:t>
             </w:r>
           </w:p>
         </w:tc>
@@ -280,7 +280,7 @@
               <w:rPr>
                 <w:sz w:val="20"/>
               </w:rPr>
-              <w:t>23,713  (79.0% of total; 94.6% of eligible)</w:t>
+              <w:t>23,740  (79.1% of total; 94.7% of eligible)</w:t>
             </w:r>
           </w:p>
         </w:tc>
@@ -388,7 +388,7 @@
               <w:rPr>
                 <w:sz w:val="20"/>
               </w:rPr>
-              <w:t>$63,010,108</w:t>
+              <w:t>$63,105,373</w:t>
             </w:r>
           </w:p>
         </w:tc>
@@ -424,7 +424,7 @@
               <w:rPr>
                 <w:sz w:val="20"/>
               </w:rPr>
-              <w:t>$931,991</w:t>
+              <w:t>$933,058</w:t>
             </w:r>
           </w:p>
         </w:tc>
@@ -460,7 +460,7 @@
               <w:rPr>
                 <w:sz w:val="20"/>
               </w:rPr>
-              <w:t>$278,091</w:t>
+              <w:t>$278,862</w:t>
             </w:r>
           </w:p>
         </w:tc>
@@ -496,7 +496,7 @@
               <w:rPr>
                 <w:sz w:val="20"/>
               </w:rPr>
-              <w:t>$653,900</w:t>
+              <w:t>$654,196</w:t>
             </w:r>
           </w:p>
         </w:tc>
@@ -604,7 +604,7 @@
               <w:rPr>
                 <w:sz w:val="20"/>
               </w:rPr>
-              <w:t>30 / 30 property tests passing</w:t>
+              <w:t>45 / 45 property tests passing</w:t>
             </w:r>
           </w:p>
         </w:tc>
@@ -2259,7 +2259,7 @@
               <w:rPr>
                 <w:sz w:val="20"/>
               </w:rPr>
-              <w:t>7,929  (100%)</w:t>
+              <w:t>7,926  (100%)</w:t>
             </w:r>
           </w:p>
         </w:tc>
@@ -2276,7 +2276,7 @@
               <w:rPr>
                 <w:sz w:val="20"/>
               </w:rPr>
-              <w:t>7,929  (88.1%)</w:t>
+              <w:t>7,926  (88.1%)</w:t>
             </w:r>
           </w:p>
         </w:tc>
@@ -2363,7 +2363,7 @@
               <w:rPr>
                 <w:sz w:val="20"/>
               </w:rPr>
-              <w:t>3,996  (74.7%)</w:t>
+              <w:t>4,026  (75.2%)</w:t>
             </w:r>
           </w:p>
         </w:tc>
@@ -2380,7 +2380,7 @@
               <w:rPr>
                 <w:sz w:val="20"/>
               </w:rPr>
-              <w:t>3,996  (73.2%)</w:t>
+              <w:t>4,026  (73.7%)</w:t>
             </w:r>
           </w:p>
         </w:tc>
@@ -2467,7 +2467,7 @@
               <w:rPr>
                 <w:sz w:val="20"/>
               </w:rPr>
-              <w:t>23,713  (94.6%)</w:t>
+              <w:t>23,740  (94.7%)</w:t>
             </w:r>
           </w:p>
         </w:tc>
@@ -2484,7 +2484,7 @@
               <w:rPr>
                 <w:sz w:val="20"/>
               </w:rPr>
-              <w:t>23,713  (79.0%)</w:t>
+              <w:t>23,740  (79.1%)</w:t>
             </w:r>
           </w:p>
         </w:tc>
@@ -2504,7 +2504,7 @@
           <w:color w:val="333333"/>
           <w:sz w:val="21"/>
         </w:rPr>
-        <w:t>Ineligible customers (last loan &lt; 60 days ago) are excluded by policy regardless of credit score — they account for all denials in the Excellent, Good, and Fair segments. Among eligible customers, Excellent/Good/Fair are approved at 100% because the $40 fee comfortably covers expected losses at their default rates. Poor customers face a 25.3% eligible rejection rate: those with larger loan balances and higher default risk produce expected losses that exceed the $40 fee, making the extension unprofitable.</w:t>
+        <w:t>Ineligible customers (last loan &lt; 60 days ago) are excluded by policy regardless of credit score — they account for all denials in the Excellent, Good, and Fair segments. Among eligible customers, Excellent/Good/Fair are approved at 100% because the $40 fee comfortably covers expected losses at their default rates. Poor customers face a 24.8% eligible rejection rate: those with larger loan balances and higher default risk produce expected losses that exceed the $40 fee, making the extension unprofitable. The optimiser also weights each decision by the probability that the customer will actually accept the offer, so extensions unlikely to be taken up are deprioritised even when individually profitable.</w:t>
       </w:r>
     </w:p>
     <w:p>
@@ -2602,7 +2602,7 @@
               <w:rPr>
                 <w:sz w:val="20"/>
               </w:rPr>
-              <w:t>$931,991</w:t>
+              <w:t>$933,058</w:t>
             </w:r>
           </w:p>
         </w:tc>
@@ -2638,7 +2638,7 @@
               <w:rPr>
                 <w:sz w:val="20"/>
               </w:rPr>
-              <w:t>−$278,091</w:t>
+              <w:t>−$278,862</w:t>
             </w:r>
           </w:p>
         </w:tc>
@@ -2674,7 +2674,7 @@
               <w:rPr>
                 <w:sz w:val="20"/>
               </w:rPr>
-              <w:t>$653,900</w:t>
+              <w:t>$654,196</w:t>
             </w:r>
           </w:p>
         </w:tc>
@@ -2746,7 +2746,7 @@
               <w:rPr>
                 <w:sz w:val="20"/>
               </w:rPr>
-              <w:t>$63,010,108</w:t>
+              <w:t>$63,105,373</w:t>
             </w:r>
           </w:p>
         </w:tc>
@@ -2802,17 +2802,19 @@
         <w:tblLook w:firstColumn="1" w:firstRow="1" w:lastColumn="0" w:lastRow="0" w:noHBand="0" w:noVBand="1" w:val="04A0"/>
       </w:tblPr>
       <w:tblGrid>
-        <w:gridCol w:w="1473"/>
-        <w:gridCol w:w="1473"/>
-        <w:gridCol w:w="1473"/>
-        <w:gridCol w:w="1473"/>
-        <w:gridCol w:w="1473"/>
-        <w:gridCol w:w="1473"/>
+        <w:gridCol w:w="1105"/>
+        <w:gridCol w:w="1105"/>
+        <w:gridCol w:w="1105"/>
+        <w:gridCol w:w="1105"/>
+        <w:gridCol w:w="1105"/>
+        <w:gridCol w:w="1105"/>
+        <w:gridCol w:w="1105"/>
+        <w:gridCol w:w="1105"/>
       </w:tblGrid>
       <w:tr>
         <w:tc>
           <w:tcPr>
-            <w:tcW w:type="dxa" w:w="1473"/>
+            <w:tcW w:type="dxa" w:w="1105"/>
             <w:shd w:val="clear" w:color="auto" w:fill="1A4A6B"/>
           </w:tcPr>
           <w:p>
@@ -2831,7 +2833,7 @@
         </w:tc>
         <w:tc>
           <w:tcPr>
-            <w:tcW w:type="dxa" w:w="1473"/>
+            <w:tcW w:type="dxa" w:w="1105"/>
             <w:shd w:val="clear" w:color="auto" w:fill="1A4A6B"/>
           </w:tcPr>
           <w:p>
@@ -2844,13 +2846,13 @@
                 <w:color w:val="FFFFFF"/>
                 <w:sz w:val="20"/>
               </w:rPr>
-              <w:t>GDP Growth</w:t>
+              <w:t>GDP</w:t>
             </w:r>
           </w:p>
         </w:tc>
         <w:tc>
           <w:tcPr>
-            <w:tcW w:type="dxa" w:w="1473"/>
+            <w:tcW w:type="dxa" w:w="1105"/>
             <w:shd w:val="clear" w:color="auto" w:fill="1A4A6B"/>
           </w:tcPr>
           <w:p>
@@ -2869,7 +2871,7 @@
         </w:tc>
         <w:tc>
           <w:tcPr>
-            <w:tcW w:type="dxa" w:w="1473"/>
+            <w:tcW w:type="dxa" w:w="1105"/>
             <w:shd w:val="clear" w:color="auto" w:fill="1A4A6B"/>
           </w:tcPr>
           <w:p>
@@ -2888,7 +2890,7 @@
         </w:tc>
         <w:tc>
           <w:tcPr>
-            <w:tcW w:type="dxa" w:w="1473"/>
+            <w:tcW w:type="dxa" w:w="1105"/>
             <w:shd w:val="clear" w:color="auto" w:fill="1A4A6B"/>
           </w:tcPr>
           <w:p>
@@ -2901,13 +2903,32 @@
                 <w:color w:val="FFFFFF"/>
                 <w:sz w:val="20"/>
               </w:rPr>
-              <w:t>Extensions Granted</w:t>
+              <w:t>Risk Cap</w:t>
             </w:r>
           </w:p>
         </w:tc>
         <w:tc>
           <w:tcPr>
-            <w:tcW w:type="dxa" w:w="1473"/>
+            <w:tcW w:type="dxa" w:w="1105"/>
+            <w:shd w:val="clear" w:color="auto" w:fill="1A4A6B"/>
+          </w:tcPr>
+          <w:p>
+            <w:pPr>
+              <w:jc w:val="center"/>
+            </w:pPr>
+            <w:r>
+              <w:rPr>
+                <w:b/>
+                <w:color w:val="FFFFFF"/>
+                <w:sz w:val="20"/>
+              </w:rPr>
+              <w:t>Granted</w:t>
+            </w:r>
+          </w:p>
+        </w:tc>
+        <w:tc>
+          <w:tcPr>
+            <w:tcW w:type="dxa" w:w="1105"/>
             <w:shd w:val="clear" w:color="auto" w:fill="1A4A6B"/>
           </w:tcPr>
           <w:p>
@@ -2924,11 +2945,30 @@
             </w:r>
           </w:p>
         </w:tc>
+        <w:tc>
+          <w:tcPr>
+            <w:tcW w:type="dxa" w:w="1105"/>
+            <w:shd w:val="clear" w:color="auto" w:fill="1A4A6B"/>
+          </w:tcPr>
+          <w:p>
+            <w:pPr>
+              <w:jc w:val="center"/>
+            </w:pPr>
+            <w:r>
+              <w:rPr>
+                <w:b/>
+                <w:color w:val="FFFFFF"/>
+                <w:sz w:val="20"/>
+              </w:rPr>
+              <w:t>Port. Risk</w:t>
+            </w:r>
+          </w:p>
+        </w:tc>
       </w:tr>
       <w:tr>
         <w:tc>
           <w:tcPr>
-            <w:tcW w:type="dxa" w:w="1473"/>
+            <w:tcW w:type="dxa" w:w="1105"/>
             <w:shd w:val="clear" w:color="auto" w:fill="E8F4F8"/>
           </w:tcPr>
           <w:p>
@@ -2945,7 +2985,7 @@
         </w:tc>
         <w:tc>
           <w:tcPr>
-            <w:tcW w:type="dxa" w:w="1473"/>
+            <w:tcW w:type="dxa" w:w="1105"/>
             <w:shd w:val="clear" w:color="auto" w:fill="E8F4F8"/>
           </w:tcPr>
           <w:p>
@@ -2962,7 +3002,7 @@
         </w:tc>
         <w:tc>
           <w:tcPr>
-            <w:tcW w:type="dxa" w:w="1473"/>
+            <w:tcW w:type="dxa" w:w="1105"/>
             <w:shd w:val="clear" w:color="auto" w:fill="E8F4F8"/>
           </w:tcPr>
           <w:p>
@@ -2979,7 +3019,7 @@
         </w:tc>
         <w:tc>
           <w:tcPr>
-            <w:tcW w:type="dxa" w:w="1473"/>
+            <w:tcW w:type="dxa" w:w="1105"/>
             <w:shd w:val="clear" w:color="auto" w:fill="E8F4F8"/>
           </w:tcPr>
           <w:p>
@@ -2996,7 +3036,7 @@
         </w:tc>
         <w:tc>
           <w:tcPr>
-            <w:tcW w:type="dxa" w:w="1473"/>
+            <w:tcW w:type="dxa" w:w="1105"/>
             <w:shd w:val="clear" w:color="auto" w:fill="E8F4F8"/>
           </w:tcPr>
           <w:p>
@@ -3007,13 +3047,13 @@
               <w:rPr>
                 <w:sz w:val="20"/>
               </w:rPr>
-              <w:t>~24,497</w:t>
+              <w:t>5.5%</w:t>
             </w:r>
           </w:p>
         </w:tc>
         <w:tc>
           <w:tcPr>
-            <w:tcW w:type="dxa" w:w="1473"/>
+            <w:tcW w:type="dxa" w:w="1105"/>
             <w:shd w:val="clear" w:color="auto" w:fill="E8F4F8"/>
           </w:tcPr>
           <w:p>
@@ -3024,7 +3064,41 @@
               <w:rPr>
                 <w:sz w:val="20"/>
               </w:rPr>
-              <w:t>Higher</w:t>
+              <w:t>24,486</w:t>
+            </w:r>
+          </w:p>
+        </w:tc>
+        <w:tc>
+          <w:tcPr>
+            <w:tcW w:type="dxa" w:w="1105"/>
+            <w:shd w:val="clear" w:color="auto" w:fill="E8F4F8"/>
+          </w:tcPr>
+          <w:p>
+            <w:pPr>
+              <w:jc w:val="center"/>
+            </w:pPr>
+            <w:r>
+              <w:rPr>
+                <w:sz w:val="20"/>
+              </w:rPr>
+              <w:t>$698,259</w:t>
+            </w:r>
+          </w:p>
+        </w:tc>
+        <w:tc>
+          <w:tcPr>
+            <w:tcW w:type="dxa" w:w="1105"/>
+            <w:shd w:val="clear" w:color="auto" w:fill="E8F4F8"/>
+          </w:tcPr>
+          <w:p>
+            <w:pPr>
+              <w:jc w:val="center"/>
+            </w:pPr>
+            <w:r>
+              <w:rPr>
+                <w:sz w:val="20"/>
+              </w:rPr>
+              <w:t>0.76%</w:t>
             </w:r>
           </w:p>
         </w:tc>
@@ -3032,7 +3106,7 @@
       <w:tr>
         <w:tc>
           <w:tcPr>
-            <w:tcW w:type="dxa" w:w="1473"/>
+            <w:tcW w:type="dxa" w:w="1105"/>
             <w:shd w:val="clear" w:color="auto" w:fill="FFFFFF"/>
           </w:tcPr>
           <w:p>
@@ -3049,7 +3123,7 @@
         </w:tc>
         <w:tc>
           <w:tcPr>
-            <w:tcW w:type="dxa" w:w="1473"/>
+            <w:tcW w:type="dxa" w:w="1105"/>
             <w:shd w:val="clear" w:color="auto" w:fill="FFFFFF"/>
           </w:tcPr>
           <w:p>
@@ -3066,7 +3140,7 @@
         </w:tc>
         <w:tc>
           <w:tcPr>
-            <w:tcW w:type="dxa" w:w="1473"/>
+            <w:tcW w:type="dxa" w:w="1105"/>
             <w:shd w:val="clear" w:color="auto" w:fill="FFFFFF"/>
           </w:tcPr>
           <w:p>
@@ -3083,7 +3157,7 @@
         </w:tc>
         <w:tc>
           <w:tcPr>
-            <w:tcW w:type="dxa" w:w="1473"/>
+            <w:tcW w:type="dxa" w:w="1105"/>
             <w:shd w:val="clear" w:color="auto" w:fill="FFFFFF"/>
           </w:tcPr>
           <w:p>
@@ -3100,7 +3174,7 @@
         </w:tc>
         <w:tc>
           <w:tcPr>
-            <w:tcW w:type="dxa" w:w="1473"/>
+            <w:tcW w:type="dxa" w:w="1105"/>
             <w:shd w:val="clear" w:color="auto" w:fill="FFFFFF"/>
           </w:tcPr>
           <w:p>
@@ -3111,13 +3185,13 @@
               <w:rPr>
                 <w:sz w:val="20"/>
               </w:rPr>
-              <w:t>23,713</w:t>
+              <w:t>5.0%</w:t>
             </w:r>
           </w:p>
         </w:tc>
         <w:tc>
           <w:tcPr>
-            <w:tcW w:type="dxa" w:w="1473"/>
+            <w:tcW w:type="dxa" w:w="1105"/>
             <w:shd w:val="clear" w:color="auto" w:fill="FFFFFF"/>
           </w:tcPr>
           <w:p>
@@ -3128,7 +3202,41 @@
               <w:rPr>
                 <w:sz w:val="20"/>
               </w:rPr>
-              <w:t>$653,900</w:t>
+              <w:t>23,740</w:t>
+            </w:r>
+          </w:p>
+        </w:tc>
+        <w:tc>
+          <w:tcPr>
+            <w:tcW w:type="dxa" w:w="1105"/>
+            <w:shd w:val="clear" w:color="auto" w:fill="FFFFFF"/>
+          </w:tcPr>
+          <w:p>
+            <w:pPr>
+              <w:jc w:val="center"/>
+            </w:pPr>
+            <w:r>
+              <w:rPr>
+                <w:sz w:val="20"/>
+              </w:rPr>
+              <w:t>$654,196</w:t>
+            </w:r>
+          </w:p>
+        </w:tc>
+        <w:tc>
+          <w:tcPr>
+            <w:tcW w:type="dxa" w:w="1105"/>
+            <w:shd w:val="clear" w:color="auto" w:fill="FFFFFF"/>
+          </w:tcPr>
+          <w:p>
+            <w:pPr>
+              <w:jc w:val="center"/>
+            </w:pPr>
+            <w:r>
+              <w:rPr>
+                <w:sz w:val="20"/>
+              </w:rPr>
+              <w:t>0.90%</w:t>
             </w:r>
           </w:p>
         </w:tc>
@@ -3136,7 +3244,7 @@
       <w:tr>
         <w:tc>
           <w:tcPr>
-            <w:tcW w:type="dxa" w:w="1473"/>
+            <w:tcW w:type="dxa" w:w="1105"/>
             <w:shd w:val="clear" w:color="auto" w:fill="E8F4F8"/>
           </w:tcPr>
           <w:p>
@@ -3153,7 +3261,7 @@
         </w:tc>
         <w:tc>
           <w:tcPr>
-            <w:tcW w:type="dxa" w:w="1473"/>
+            <w:tcW w:type="dxa" w:w="1105"/>
             <w:shd w:val="clear" w:color="auto" w:fill="E8F4F8"/>
           </w:tcPr>
           <w:p>
@@ -3170,7 +3278,7 @@
         </w:tc>
         <w:tc>
           <w:tcPr>
-            <w:tcW w:type="dxa" w:w="1473"/>
+            <w:tcW w:type="dxa" w:w="1105"/>
             <w:shd w:val="clear" w:color="auto" w:fill="E8F4F8"/>
           </w:tcPr>
           <w:p>
@@ -3187,7 +3295,7 @@
         </w:tc>
         <w:tc>
           <w:tcPr>
-            <w:tcW w:type="dxa" w:w="1473"/>
+            <w:tcW w:type="dxa" w:w="1105"/>
             <w:shd w:val="clear" w:color="auto" w:fill="E8F4F8"/>
           </w:tcPr>
           <w:p>
@@ -3204,7 +3312,7 @@
         </w:tc>
         <w:tc>
           <w:tcPr>
-            <w:tcW w:type="dxa" w:w="1473"/>
+            <w:tcW w:type="dxa" w:w="1105"/>
             <w:shd w:val="clear" w:color="auto" w:fill="E8F4F8"/>
           </w:tcPr>
           <w:p>
@@ -3215,13 +3323,13 @@
               <w:rPr>
                 <w:sz w:val="20"/>
               </w:rPr>
-              <w:t>Slightly fewer</w:t>
+              <w:t>4.5%</w:t>
             </w:r>
           </w:p>
         </w:tc>
         <w:tc>
           <w:tcPr>
-            <w:tcW w:type="dxa" w:w="1473"/>
+            <w:tcW w:type="dxa" w:w="1105"/>
             <w:shd w:val="clear" w:color="auto" w:fill="E8F4F8"/>
           </w:tcPr>
           <w:p>
@@ -3232,7 +3340,41 @@
               <w:rPr>
                 <w:sz w:val="20"/>
               </w:rPr>
-              <w:t>Lower but positive</w:t>
+              <w:t>22,670</w:t>
+            </w:r>
+          </w:p>
+        </w:tc>
+        <w:tc>
+          <w:tcPr>
+            <w:tcW w:type="dxa" w:w="1105"/>
+            <w:shd w:val="clear" w:color="auto" w:fill="E8F4F8"/>
+          </w:tcPr>
+          <w:p>
+            <w:pPr>
+              <w:jc w:val="center"/>
+            </w:pPr>
+            <w:r>
+              <w:rPr>
+                <w:sz w:val="20"/>
+              </w:rPr>
+              <w:t>$589,438</w:t>
+            </w:r>
+          </w:p>
+        </w:tc>
+        <w:tc>
+          <w:tcPr>
+            <w:tcW w:type="dxa" w:w="1105"/>
+            <w:shd w:val="clear" w:color="auto" w:fill="E8F4F8"/>
+          </w:tcPr>
+          <w:p>
+            <w:pPr>
+              <w:jc w:val="center"/>
+            </w:pPr>
+            <w:r>
+              <w:rPr>
+                <w:sz w:val="20"/>
+              </w:rPr>
+              <w:t>1.12%</w:t>
             </w:r>
           </w:p>
         </w:tc>
@@ -3252,7 +3394,7 @@
           <w:color w:val="333333"/>
           <w:sz w:val="21"/>
         </w:rPr>
-        <w:t>Under the adverse scenario, higher unemployment and interest rates increase modelled default rates. The optimiser responds automatically — it becomes more selective, approving fewer borderline customers to keep the portfolio within the 5% risk cap. In all scenarios the programme remains profitable.</w:t>
+        <w:t>Under the adverse scenario the model makes two automatic adjustments: it raises estimated default rates (by 35%) and tightens the portfolio risk cap to 4.5% (down from 5.0%). This double safeguard means the optimiser becomes meaningfully more selective — 1,070 fewer extensions are granted — while the programme still generates $589K in net profit. All three scenarios remain profitable.</w:t>
       </w:r>
     </w:p>
     <w:tbl>
@@ -3288,7 +3430,7 @@
                 <w:color w:val="333333"/>
                 <w:sz w:val="21"/>
               </w:rPr>
-              <w:t>Even in a recession-like environment the model remains profitable. The 5% risk cap acts as a built-in protection: the optimiser tightens approvals before losses mount.</w:t>
+              <w:t>Even in a recession-like environment the model generates $589K net profit. The model responds to stress with two levers simultaneously: raising estimated default rates AND tightening the risk cap — the optimiser tightens approvals before losses mount.</w:t>
             </w:r>
           </w:p>
         </w:tc>
@@ -4828,7 +4970,7 @@
           <w:color w:val="1A1A2E"/>
           <w:sz w:val="28"/>
         </w:rPr>
-        <w:t>7.  How to Use These Recommendations</w:t>
+        <w:t>8.  How to Use These Recommendations</w:t>
       </w:r>
     </w:p>
     <w:p>
@@ -5226,7 +5368,485 @@
           <w:color w:val="1A1A2E"/>
           <w:sz w:val="28"/>
         </w:rPr>
-        <w:t>8.  Technical Quality and Validation</w:t>
+        <w:t>7.  What Was Improved — Model Evolution</w:t>
+      </w:r>
+    </w:p>
+    <w:p>
+      <w:pPr>
+        <w:spacing w:before="0" w:after="120"/>
+      </w:pPr>
+      <w:r>
+        <w:rPr>
+          <w:color w:val="333333"/>
+          <w:sz w:val="21"/>
+        </w:rPr>
+        <w:t>The model went through a structured review comparing it against a parallel credit-limit optimisation system. Seven improvements were identified and implemented. This section summarises each change in plain terms.</w:t>
+      </w:r>
+    </w:p>
+    <w:tbl>
+      <w:tblPr>
+        <w:tblStyle w:val="TableGrid"/>
+        <w:tblW w:type="auto" w:w="0"/>
+        <w:jc w:val="center"/>
+        <w:tblLook w:firstColumn="1" w:firstRow="1" w:lastColumn="0" w:lastRow="0" w:noHBand="0" w:noVBand="1" w:val="04A0"/>
+      </w:tblPr>
+      <w:tblGrid>
+        <w:gridCol w:w="2946"/>
+        <w:gridCol w:w="2946"/>
+        <w:gridCol w:w="2946"/>
+      </w:tblGrid>
+      <w:tr>
+        <w:tc>
+          <w:tcPr>
+            <w:tcW w:type="dxa" w:w="2946"/>
+            <w:shd w:val="clear" w:color="auto" w:fill="1A4A6B"/>
+          </w:tcPr>
+          <w:p>
+            <w:pPr>
+              <w:jc w:val="center"/>
+            </w:pPr>
+            <w:r>
+              <w:rPr>
+                <w:b/>
+                <w:color w:val="FFFFFF"/>
+                <w:sz w:val="20"/>
+              </w:rPr>
+              <w:t>Improvement</w:t>
+            </w:r>
+          </w:p>
+        </w:tc>
+        <w:tc>
+          <w:tcPr>
+            <w:tcW w:type="dxa" w:w="2946"/>
+            <w:shd w:val="clear" w:color="auto" w:fill="1A4A6B"/>
+          </w:tcPr>
+          <w:p>
+            <w:pPr>
+              <w:jc w:val="center"/>
+            </w:pPr>
+            <w:r>
+              <w:rPr>
+                <w:b/>
+                <w:color w:val="FFFFFF"/>
+                <w:sz w:val="20"/>
+              </w:rPr>
+              <w:t>What changed</w:t>
+            </w:r>
+          </w:p>
+        </w:tc>
+        <w:tc>
+          <w:tcPr>
+            <w:tcW w:type="dxa" w:w="2946"/>
+            <w:shd w:val="clear" w:color="auto" w:fill="1A4A6B"/>
+          </w:tcPr>
+          <w:p>
+            <w:pPr>
+              <w:jc w:val="center"/>
+            </w:pPr>
+            <w:r>
+              <w:rPr>
+                <w:b/>
+                <w:color w:val="FFFFFF"/>
+                <w:sz w:val="20"/>
+              </w:rPr>
+              <w:t>Why it matters</w:t>
+            </w:r>
+          </w:p>
+        </w:tc>
+      </w:tr>
+      <w:tr>
+        <w:tc>
+          <w:tcPr>
+            <w:tcW w:type="dxa" w:w="2946"/>
+            <w:shd w:val="clear" w:color="auto" w:fill="E8F4F8"/>
+          </w:tcPr>
+          <w:p>
+            <w:pPr>
+              <w:jc w:val="center"/>
+            </w:pPr>
+            <w:r>
+              <w:rPr>
+                <w:sz w:val="20"/>
+              </w:rPr>
+              <w:t>Credit scoring axis</w:t>
+            </w:r>
+          </w:p>
+        </w:tc>
+        <w:tc>
+          <w:tcPr>
+            <w:tcW w:type="dxa" w:w="2946"/>
+            <w:shd w:val="clear" w:color="auto" w:fill="E8F4F8"/>
+          </w:tcPr>
+          <w:p>
+            <w:pPr>
+              <w:jc w:val="center"/>
+            </w:pPr>
+            <w:r>
+              <w:rPr>
+                <w:sz w:val="20"/>
+              </w:rPr>
+              <w:t>Clustering now runs on risk rank (0 = safest, 1 = riskiest) rather than the raw credit score. The model prints a comparison of two approaches each time it runs.</w:t>
+            </w:r>
+          </w:p>
+        </w:tc>
+        <w:tc>
+          <w:tcPr>
+            <w:tcW w:type="dxa" w:w="2946"/>
+            <w:shd w:val="clear" w:color="auto" w:fill="E8F4F8"/>
+          </w:tcPr>
+          <w:p>
+            <w:pPr>
+              <w:jc w:val="center"/>
+            </w:pPr>
+            <w:r>
+              <w:rPr>
+                <w:sz w:val="20"/>
+              </w:rPr>
+              <w:t>Clusters are formed around the quantity being managed (default risk), not its inverse. The choice of grouping method is transparent and auditable.</w:t>
+            </w:r>
+          </w:p>
+        </w:tc>
+      </w:tr>
+      <w:tr>
+        <w:tc>
+          <w:tcPr>
+            <w:tcW w:type="dxa" w:w="2946"/>
+            <w:shd w:val="clear" w:color="auto" w:fill="FFFFFF"/>
+          </w:tcPr>
+          <w:p>
+            <w:pPr>
+              <w:jc w:val="center"/>
+            </w:pPr>
+            <w:r>
+              <w:rPr>
+                <w:sz w:val="20"/>
+              </w:rPr>
+              <w:t>Simulation speed</w:t>
+            </w:r>
+          </w:p>
+        </w:tc>
+        <w:tc>
+          <w:tcPr>
+            <w:tcW w:type="dxa" w:w="2946"/>
+            <w:shd w:val="clear" w:color="auto" w:fill="FFFFFF"/>
+          </w:tcPr>
+          <w:p>
+            <w:pPr>
+              <w:jc w:val="center"/>
+            </w:pPr>
+            <w:r>
+              <w:rPr>
+                <w:sz w:val="20"/>
+              </w:rPr>
+              <w:t>The 3,500-scenario simulation for all 30,000 customers now runs in ~5 seconds. All customers are processed simultaneously rather than one at a time.</w:t>
+            </w:r>
+          </w:p>
+        </w:tc>
+        <w:tc>
+          <w:tcPr>
+            <w:tcW w:type="dxa" w:w="2946"/>
+            <w:shd w:val="clear" w:color="auto" w:fill="FFFFFF"/>
+          </w:tcPr>
+          <w:p>
+            <w:pPr>
+              <w:jc w:val="center"/>
+            </w:pPr>
+            <w:r>
+              <w:rPr>
+                <w:sz w:val="20"/>
+              </w:rPr>
+              <w:t>Faster execution means the model can be re-run for scenario testing and recalibration without delay.</w:t>
+            </w:r>
+          </w:p>
+        </w:tc>
+      </w:tr>
+      <w:tr>
+        <w:tc>
+          <w:tcPr>
+            <w:tcW w:type="dxa" w:w="2946"/>
+            <w:shd w:val="clear" w:color="auto" w:fill="E8F4F8"/>
+          </w:tcPr>
+          <w:p>
+            <w:pPr>
+              <w:jc w:val="center"/>
+            </w:pPr>
+            <w:r>
+              <w:rPr>
+                <w:sz w:val="20"/>
+              </w:rPr>
+              <w:t>Uptake probability in decisions</w:t>
+            </w:r>
+          </w:p>
+        </w:tc>
+        <w:tc>
+          <w:tcPr>
+            <w:tcW w:type="dxa" w:w="2946"/>
+            <w:shd w:val="clear" w:color="auto" w:fill="E8F4F8"/>
+          </w:tcPr>
+          <w:p>
+            <w:pPr>
+              <w:jc w:val="center"/>
+            </w:pPr>
+            <w:r>
+              <w:rPr>
+                <w:sz w:val="20"/>
+              </w:rPr>
+              <w:t>The optimiser now weights each customer's expected profit by the probability they will actually accept the offer. A customer who is profitable but unlikely to accept is deprioritised.</w:t>
+            </w:r>
+          </w:p>
+        </w:tc>
+        <w:tc>
+          <w:tcPr>
+            <w:tcW w:type="dxa" w:w="2946"/>
+            <w:shd w:val="clear" w:color="auto" w:fill="E8F4F8"/>
+          </w:tcPr>
+          <w:p>
+            <w:pPr>
+              <w:jc w:val="center"/>
+            </w:pPr>
+            <w:r>
+              <w:rPr>
+                <w:sz w:val="20"/>
+              </w:rPr>
+              <w:t>Without this, the model overstates expected revenue by approving customers who would not take up the offer in practice.</w:t>
+            </w:r>
+          </w:p>
+        </w:tc>
+      </w:tr>
+      <w:tr>
+        <w:tc>
+          <w:tcPr>
+            <w:tcW w:type="dxa" w:w="2946"/>
+            <w:shd w:val="clear" w:color="auto" w:fill="FFFFFF"/>
+          </w:tcPr>
+          <w:p>
+            <w:pPr>
+              <w:jc w:val="center"/>
+            </w:pPr>
+            <w:r>
+              <w:rPr>
+                <w:sz w:val="20"/>
+              </w:rPr>
+              <w:t>Sensitivity analysis corrected</w:t>
+            </w:r>
+          </w:p>
+        </w:tc>
+        <w:tc>
+          <w:tcPr>
+            <w:tcW w:type="dxa" w:w="2946"/>
+            <w:shd w:val="clear" w:color="auto" w:fill="FFFFFF"/>
+          </w:tcPr>
+          <w:p>
+            <w:pPr>
+              <w:jc w:val="center"/>
+            </w:pPr>
+            <w:r>
+              <w:rPr>
+                <w:sz w:val="20"/>
+              </w:rPr>
+              <w:t>Under the Adverse scenario the model now: (a) raises estimated default rates by 35%, (b) increases estimated credit losses by 25%, and (c) tightens the portfolio risk cap from 5.0% to 4.5% automatically.</w:t>
+            </w:r>
+          </w:p>
+        </w:tc>
+        <w:tc>
+          <w:tcPr>
+            <w:tcW w:type="dxa" w:w="2946"/>
+            <w:shd w:val="clear" w:color="auto" w:fill="FFFFFF"/>
+          </w:tcPr>
+          <w:p>
+            <w:pPr>
+              <w:jc w:val="center"/>
+            </w:pPr>
+            <w:r>
+              <w:rPr>
+                <w:sz w:val="20"/>
+              </w:rPr>
+              <w:t>Previously only default rates were adjusted — credit losses (which directly drive LP decisions) were left at baseline, understating the stress environment.</w:t>
+            </w:r>
+          </w:p>
+        </w:tc>
+      </w:tr>
+      <w:tr>
+        <w:tc>
+          <w:tcPr>
+            <w:tcW w:type="dxa" w:w="2946"/>
+            <w:shd w:val="clear" w:color="auto" w:fill="E8F4F8"/>
+          </w:tcPr>
+          <w:p>
+            <w:pPr>
+              <w:jc w:val="center"/>
+            </w:pPr>
+            <w:r>
+              <w:rPr>
+                <w:sz w:val="20"/>
+              </w:rPr>
+              <w:t>Scenario constants centralised</w:t>
+            </w:r>
+          </w:p>
+        </w:tc>
+        <w:tc>
+          <w:tcPr>
+            <w:tcW w:type="dxa" w:w="2946"/>
+            <w:shd w:val="clear" w:color="auto" w:fill="E8F4F8"/>
+          </w:tcPr>
+          <w:p>
+            <w:pPr>
+              <w:jc w:val="center"/>
+            </w:pPr>
+            <w:r>
+              <w:rPr>
+                <w:sz w:val="20"/>
+              </w:rPr>
+              <w:t>Optimistic / Baseline / Adverse macro parameters are defined once and used consistently across credit scoring, uptake forecasting, and sensitivity steps.</w:t>
+            </w:r>
+          </w:p>
+        </w:tc>
+        <w:tc>
+          <w:tcPr>
+            <w:tcW w:type="dxa" w:w="2946"/>
+            <w:shd w:val="clear" w:color="auto" w:fill="E8F4F8"/>
+          </w:tcPr>
+          <w:p>
+            <w:pPr>
+              <w:jc w:val="center"/>
+            </w:pPr>
+            <w:r>
+              <w:rPr>
+                <w:sz w:val="20"/>
+              </w:rPr>
+              <w:t>Prevents scenarios from drifting out of sync across model components — a common source of subtle errors in multi-step systems.</w:t>
+            </w:r>
+          </w:p>
+        </w:tc>
+      </w:tr>
+      <w:tr>
+        <w:tc>
+          <w:tcPr>
+            <w:tcW w:type="dxa" w:w="2946"/>
+            <w:shd w:val="clear" w:color="auto" w:fill="FFFFFF"/>
+          </w:tcPr>
+          <w:p>
+            <w:pPr>
+              <w:jc w:val="center"/>
+            </w:pPr>
+            <w:r>
+              <w:rPr>
+                <w:sz w:val="20"/>
+              </w:rPr>
+              <w:t>12 charts (up from 7)</w:t>
+            </w:r>
+          </w:p>
+        </w:tc>
+        <w:tc>
+          <w:tcPr>
+            <w:tcW w:type="dxa" w:w="2946"/>
+            <w:shd w:val="clear" w:color="auto" w:fill="FFFFFF"/>
+          </w:tcPr>
+          <w:p>
+            <w:pPr>
+              <w:jc w:val="center"/>
+            </w:pPr>
+            <w:r>
+              <w:rPr>
+                <w:sz w:val="20"/>
+              </w:rPr>
+              <w:t>Five new visualisations: decision boundary (approved vs denied by loan/risk), Pareto curve (profit concentration), term and uptake distributions, sensitivity detail, and risk-exposure histogram.</w:t>
+            </w:r>
+          </w:p>
+        </w:tc>
+        <w:tc>
+          <w:tcPr>
+            <w:tcW w:type="dxa" w:w="2946"/>
+            <w:shd w:val="clear" w:color="auto" w:fill="FFFFFF"/>
+          </w:tcPr>
+          <w:p>
+            <w:pPr>
+              <w:jc w:val="center"/>
+            </w:pPr>
+            <w:r>
+              <w:rPr>
+                <w:sz w:val="20"/>
+              </w:rPr>
+              <w:t>The decision boundary chart makes the approval logic visible to a non-technical audience without requiring code review.</w:t>
+            </w:r>
+          </w:p>
+        </w:tc>
+      </w:tr>
+      <w:tr>
+        <w:tc>
+          <w:tcPr>
+            <w:tcW w:type="dxa" w:w="2946"/>
+            <w:shd w:val="clear" w:color="auto" w:fill="E8F4F8"/>
+          </w:tcPr>
+          <w:p>
+            <w:pPr>
+              <w:jc w:val="center"/>
+            </w:pPr>
+            <w:r>
+              <w:rPr>
+                <w:sz w:val="20"/>
+              </w:rPr>
+              <w:t>45 automated checks (up from 30)</w:t>
+            </w:r>
+          </w:p>
+        </w:tc>
+        <w:tc>
+          <w:tcPr>
+            <w:tcW w:type="dxa" w:w="2946"/>
+            <w:shd w:val="clear" w:color="auto" w:fill="E8F4F8"/>
+          </w:tcPr>
+          <w:p>
+            <w:pPr>
+              <w:jc w:val="center"/>
+            </w:pPr>
+            <w:r>
+              <w:rPr>
+                <w:sz w:val="20"/>
+              </w:rPr>
+              <w:t>15 new correctness tests covering macro constants, risk-rank column, K-Means model label, Markov matrix shape, uptake weighting in objective, loss update per scenario, adverse cap tightening, chart count, and results export.</w:t>
+            </w:r>
+          </w:p>
+        </w:tc>
+        <w:tc>
+          <w:tcPr>
+            <w:tcW w:type="dxa" w:w="2946"/>
+            <w:shd w:val="clear" w:color="auto" w:fill="E8F4F8"/>
+          </w:tcPr>
+          <w:p>
+            <w:pPr>
+              <w:jc w:val="center"/>
+            </w:pPr>
+            <w:r>
+              <w:rPr>
+                <w:sz w:val="20"/>
+              </w:rPr>
+              <w:t>More checks make the model harder to break during recalibration. They act as a safety net for future data or parameter changes.</w:t>
+            </w:r>
+          </w:p>
+        </w:tc>
+      </w:tr>
+    </w:tbl>
+    <w:p>
+      <w:pPr>
+        <w:spacing w:after="160"/>
+      </w:pPr>
+    </w:p>
+    <w:p>
+      <w:pPr>
+        <w:spacing w:after="120"/>
+      </w:pPr>
+    </w:p>
+    <w:p>
+      <w:pPr>
+        <w:spacing w:before="320" w:after="80"/>
+      </w:pPr>
+      <w:r>
+        <w:rPr>
+          <w:b/>
+          <w:color w:val="1A1A2E"/>
+          <w:sz w:val="28"/>
+        </w:rPr>
+        <w:t>9.  Technical Quality and Validation</w:t>
       </w:r>
     </w:p>
     <w:p>
@@ -5249,13 +5869,14 @@
         <w:tblLook w:firstColumn="1" w:firstRow="1" w:lastColumn="0" w:lastRow="0" w:noHBand="0" w:noVBand="1" w:val="04A0"/>
       </w:tblPr>
       <w:tblGrid>
-        <w:gridCol w:w="4419"/>
-        <w:gridCol w:w="4419"/>
+        <w:gridCol w:w="2946"/>
+        <w:gridCol w:w="2946"/>
+        <w:gridCol w:w="2946"/>
       </w:tblGrid>
       <w:tr>
         <w:tc>
           <w:tcPr>
-            <w:tcW w:type="dxa" w:w="4419"/>
+            <w:tcW w:type="dxa" w:w="2946"/>
             <w:shd w:val="clear" w:color="auto" w:fill="1A4A6B"/>
           </w:tcPr>
           <w:p>
@@ -5274,7 +5895,7 @@
         </w:tc>
         <w:tc>
           <w:tcPr>
-            <w:tcW w:type="dxa" w:w="4419"/>
+            <w:tcW w:type="dxa" w:w="2946"/>
             <w:shd w:val="clear" w:color="auto" w:fill="1A4A6B"/>
           </w:tcPr>
           <w:p>
@@ -5291,11 +5912,30 @@
             </w:r>
           </w:p>
         </w:tc>
+        <w:tc>
+          <w:tcPr>
+            <w:tcW w:type="dxa" w:w="2946"/>
+            <w:shd w:val="clear" w:color="auto" w:fill="1A4A6B"/>
+          </w:tcPr>
+          <w:p>
+            <w:pPr>
+              <w:jc w:val="center"/>
+            </w:pPr>
+            <w:r>
+              <w:rPr>
+                <w:b/>
+                <w:color w:val="FFFFFF"/>
+                <w:sz w:val="20"/>
+              </w:rPr>
+              <w:t>Result</w:t>
+            </w:r>
+          </w:p>
+        </w:tc>
       </w:tr>
       <w:tr>
         <w:tc>
           <w:tcPr>
-            <w:tcW w:type="dxa" w:w="4419"/>
+            <w:tcW w:type="dxa" w:w="2946"/>
             <w:shd w:val="clear" w:color="auto" w:fill="E8F4F8"/>
           </w:tcPr>
           <w:p>
@@ -5306,13 +5946,13 @@
               <w:rPr>
                 <w:sz w:val="20"/>
               </w:rPr>
-              <w:t>P21 — Monte Carlo iterations</w:t>
+              <w:t>P08 — Monte Carlo iterations</w:t>
             </w:r>
           </w:p>
         </w:tc>
         <w:tc>
           <w:tcPr>
-            <w:tcW w:type="dxa" w:w="4419"/>
+            <w:tcW w:type="dxa" w:w="2946"/>
             <w:shd w:val="clear" w:color="auto" w:fill="E8F4F8"/>
           </w:tcPr>
           <w:p>
@@ -5323,7 +5963,24 @@
               <w:rPr>
                 <w:sz w:val="20"/>
               </w:rPr>
-              <w:t>≥ 3,000 simulations per customer (we run 3,500)</w:t>
+              <w:t>≥ 3,000 simulations per customer</w:t>
+            </w:r>
+          </w:p>
+        </w:tc>
+        <w:tc>
+          <w:tcPr>
+            <w:tcW w:type="dxa" w:w="2946"/>
+            <w:shd w:val="clear" w:color="auto" w:fill="E8F4F8"/>
+          </w:tcPr>
+          <w:p>
+            <w:pPr>
+              <w:jc w:val="center"/>
+            </w:pPr>
+            <w:r>
+              <w:rPr>
+                <w:sz w:val="20"/>
+              </w:rPr>
+              <w:t>3,500 ✓</w:t>
             </w:r>
           </w:p>
         </w:tc>
@@ -5331,7 +5988,7 @@
       <w:tr>
         <w:tc>
           <w:tcPr>
-            <w:tcW w:type="dxa" w:w="4419"/>
+            <w:tcW w:type="dxa" w:w="2946"/>
             <w:shd w:val="clear" w:color="auto" w:fill="FFFFFF"/>
           </w:tcPr>
           <w:p>
@@ -5342,13 +5999,13 @@
               <w:rPr>
                 <w:sz w:val="20"/>
               </w:rPr>
-              <w:t>P25 — LP optimality</w:t>
+              <w:t>P20 — Portfolio risk cap</w:t>
             </w:r>
           </w:p>
         </w:tc>
         <w:tc>
           <w:tcPr>
-            <w:tcW w:type="dxa" w:w="4419"/>
+            <w:tcW w:type="dxa" w:w="2946"/>
             <w:shd w:val="clear" w:color="auto" w:fill="FFFFFF"/>
           </w:tcPr>
           <w:p>
@@ -5359,7 +6016,24 @@
               <w:rPr>
                 <w:sz w:val="20"/>
               </w:rPr>
-              <w:t>Solver confirms optimal solution found</w:t>
+              <w:t>Portfolio default rate ≤ 5%</w:t>
+            </w:r>
+          </w:p>
+        </w:tc>
+        <w:tc>
+          <w:tcPr>
+            <w:tcW w:type="dxa" w:w="2946"/>
+            <w:shd w:val="clear" w:color="auto" w:fill="FFFFFF"/>
+          </w:tcPr>
+          <w:p>
+            <w:pPr>
+              <w:jc w:val="center"/>
+            </w:pPr>
+            <w:r>
+              <w:rPr>
+                <w:sz w:val="20"/>
+              </w:rPr>
+              <w:t>0.90% ✓</w:t>
             </w:r>
           </w:p>
         </w:tc>
@@ -5367,7 +6041,7 @@
       <w:tr>
         <w:tc>
           <w:tcPr>
-            <w:tcW w:type="dxa" w:w="4419"/>
+            <w:tcW w:type="dxa" w:w="2946"/>
             <w:shd w:val="clear" w:color="auto" w:fill="E8F4F8"/>
           </w:tcPr>
           <w:p>
@@ -5378,13 +6052,13 @@
               <w:rPr>
                 <w:sz w:val="20"/>
               </w:rPr>
-              <w:t>P26 — Constraint satisfaction</w:t>
+              <w:t>P39 — Uptake in objective</w:t>
             </w:r>
           </w:p>
         </w:tc>
         <w:tc>
           <w:tcPr>
-            <w:tcW w:type="dxa" w:w="4419"/>
+            <w:tcW w:type="dxa" w:w="2946"/>
             <w:shd w:val="clear" w:color="auto" w:fill="E8F4F8"/>
           </w:tcPr>
           <w:p>
@@ -5395,7 +6069,24 @@
               <w:rPr>
                 <w:sz w:val="20"/>
               </w:rPr>
-              <w:t>All hard constraints met in final solution</w:t>
+              <w:t>LP objective weighted by uptake probability</w:t>
+            </w:r>
+          </w:p>
+        </w:tc>
+        <w:tc>
+          <w:tcPr>
+            <w:tcW w:type="dxa" w:w="2946"/>
+            <w:shd w:val="clear" w:color="auto" w:fill="E8F4F8"/>
+          </w:tcPr>
+          <w:p>
+            <w:pPr>
+              <w:jc w:val="center"/>
+            </w:pPr>
+            <w:r>
+              <w:rPr>
+                <w:sz w:val="20"/>
+              </w:rPr>
+              <w:t>✓</w:t>
             </w:r>
           </w:p>
         </w:tc>
@@ -5403,7 +6094,7 @@
       <w:tr>
         <w:tc>
           <w:tcPr>
-            <w:tcW w:type="dxa" w:w="4419"/>
+            <w:tcW w:type="dxa" w:w="2946"/>
             <w:shd w:val="clear" w:color="auto" w:fill="FFFFFF"/>
           </w:tcPr>
           <w:p>
@@ -5414,13 +6105,13 @@
               <w:rPr>
                 <w:sz w:val="20"/>
               </w:rPr>
-              <w:t>P27 — Non-negative extensions</w:t>
+              <w:t>P41 — Sensitivity loss updated</w:t>
             </w:r>
           </w:p>
         </w:tc>
         <w:tc>
           <w:tcPr>
-            <w:tcW w:type="dxa" w:w="4419"/>
+            <w:tcW w:type="dxa" w:w="2946"/>
             <w:shd w:val="clear" w:color="auto" w:fill="FFFFFF"/>
           </w:tcPr>
           <w:p>
@@ -5431,7 +6122,24 @@
               <w:rPr>
                 <w:sz w:val="20"/>
               </w:rPr>
-              <w:t>No customer receives a negative term extension</w:t>
+              <w:t>Expected loss differs across scenarios</w:t>
+            </w:r>
+          </w:p>
+        </w:tc>
+        <w:tc>
+          <w:tcPr>
+            <w:tcW w:type="dxa" w:w="2946"/>
+            <w:shd w:val="clear" w:color="auto" w:fill="FFFFFF"/>
+          </w:tcPr>
+          <w:p>
+            <w:pPr>
+              <w:jc w:val="center"/>
+            </w:pPr>
+            <w:r>
+              <w:rPr>
+                <w:sz w:val="20"/>
+              </w:rPr>
+              <w:t>0.85×/1.0×/1.25× ✓</w:t>
             </w:r>
           </w:p>
         </w:tc>
@@ -5439,7 +6147,7 @@
       <w:tr>
         <w:tc>
           <w:tcPr>
-            <w:tcW w:type="dxa" w:w="4419"/>
+            <w:tcW w:type="dxa" w:w="2946"/>
             <w:shd w:val="clear" w:color="auto" w:fill="E8F4F8"/>
           </w:tcPr>
           <w:p>
@@ -5450,13 +6158,13 @@
               <w:rPr>
                 <w:sz w:val="20"/>
               </w:rPr>
-              <w:t>P29 — Portfolio risk cap</w:t>
+              <w:t>P43 — Adverse cap tighter</w:t>
             </w:r>
           </w:p>
         </w:tc>
         <w:tc>
           <w:tcPr>
-            <w:tcW w:type="dxa" w:w="4419"/>
+            <w:tcW w:type="dxa" w:w="2946"/>
             <w:shd w:val="clear" w:color="auto" w:fill="E8F4F8"/>
           </w:tcPr>
           <w:p>
@@ -5467,7 +6175,24 @@
               <w:rPr>
                 <w:sz w:val="20"/>
               </w:rPr>
-              <w:t>Portfolio default rate ≤ 5% (actual: 0.90%)</w:t>
+              <w:t>Adverse risk cap &lt; baseline cap</w:t>
+            </w:r>
+          </w:p>
+        </w:tc>
+        <w:tc>
+          <w:tcPr>
+            <w:tcW w:type="dxa" w:w="2946"/>
+            <w:shd w:val="clear" w:color="auto" w:fill="E8F4F8"/>
+          </w:tcPr>
+          <w:p>
+            <w:pPr>
+              <w:jc w:val="center"/>
+            </w:pPr>
+            <w:r>
+              <w:rPr>
+                <w:sz w:val="20"/>
+              </w:rPr>
+              <w:t>4.5% &lt; 5.0% ✓</w:t>
             </w:r>
           </w:p>
         </w:tc>
@@ -5475,7 +6200,7 @@
       <w:tr>
         <w:tc>
           <w:tcPr>
-            <w:tcW w:type="dxa" w:w="4419"/>
+            <w:tcW w:type="dxa" w:w="2946"/>
             <w:shd w:val="clear" w:color="auto" w:fill="FFFFFF"/>
           </w:tcPr>
           <w:p>
@@ -5486,13 +6211,13 @@
               <w:rPr>
                 <w:sz w:val="20"/>
               </w:rPr>
-              <w:t>P30 — Solver status</w:t>
+              <w:t>P44 — Visualisations</w:t>
             </w:r>
           </w:p>
         </w:tc>
         <w:tc>
           <w:tcPr>
-            <w:tcW w:type="dxa" w:w="4419"/>
+            <w:tcW w:type="dxa" w:w="2946"/>
             <w:shd w:val="clear" w:color="auto" w:fill="FFFFFF"/>
           </w:tcPr>
           <w:p>
@@ -5503,7 +6228,24 @@
               <w:rPr>
                 <w:sz w:val="20"/>
               </w:rPr>
-              <w:t>LP returns 'Optimal' status</w:t>
+              <w:t>≥ 10 charts produced</w:t>
+            </w:r>
+          </w:p>
+        </w:tc>
+        <w:tc>
+          <w:tcPr>
+            <w:tcW w:type="dxa" w:w="2946"/>
+            <w:shd w:val="clear" w:color="auto" w:fill="FFFFFF"/>
+          </w:tcPr>
+          <w:p>
+            <w:pPr>
+              <w:jc w:val="center"/>
+            </w:pPr>
+            <w:r>
+              <w:rPr>
+                <w:sz w:val="20"/>
+              </w:rPr>
+              <w:t>12 charts ✓</w:t>
             </w:r>
           </w:p>
         </w:tc>
@@ -5511,7 +6253,7 @@
       <w:tr>
         <w:tc>
           <w:tcPr>
-            <w:tcW w:type="dxa" w:w="4419"/>
+            <w:tcW w:type="dxa" w:w="2946"/>
             <w:shd w:val="clear" w:color="auto" w:fill="E8F4F8"/>
           </w:tcPr>
           <w:p>
@@ -5522,13 +6264,13 @@
               <w:rPr>
                 <w:sz w:val="20"/>
               </w:rPr>
-              <w:t>P36 — Visualisations</w:t>
+              <w:t>P45 — Results exported</w:t>
             </w:r>
           </w:p>
         </w:tc>
         <w:tc>
           <w:tcPr>
-            <w:tcW w:type="dxa" w:w="4419"/>
+            <w:tcW w:type="dxa" w:w="2946"/>
             <w:shd w:val="clear" w:color="auto" w:fill="E8F4F8"/>
           </w:tcPr>
           <w:p>
@@ -5539,7 +6281,24 @@
               <w:rPr>
                 <w:sz w:val="20"/>
               </w:rPr>
-              <w:t>At least 10 charts produced (we produce 14)</w:t>
+              <w:t>30,000-row results file exists</w:t>
+            </w:r>
+          </w:p>
+        </w:tc>
+        <w:tc>
+          <w:tcPr>
+            <w:tcW w:type="dxa" w:w="2946"/>
+            <w:shd w:val="clear" w:color="auto" w:fill="E8F4F8"/>
+          </w:tcPr>
+          <w:p>
+            <w:pPr>
+              <w:jc w:val="center"/>
+            </w:pPr>
+            <w:r>
+              <w:rPr>
+                <w:sz w:val="20"/>
+              </w:rPr>
+              <w:t>✓</w:t>
             </w:r>
           </w:p>
         </w:tc>
@@ -5547,7 +6306,7 @@
       <w:tr>
         <w:tc>
           <w:tcPr>
-            <w:tcW w:type="dxa" w:w="4419"/>
+            <w:tcW w:type="dxa" w:w="2946"/>
             <w:shd w:val="clear" w:color="auto" w:fill="FFFFFF"/>
           </w:tcPr>
           <w:p>
@@ -5558,13 +6317,13 @@
               <w:rPr>
                 <w:sz w:val="20"/>
               </w:rPr>
-              <w:t>P38 — Runtime</w:t>
+              <w:t>TOTAL</w:t>
             </w:r>
           </w:p>
         </w:tc>
         <w:tc>
           <w:tcPr>
-            <w:tcW w:type="dxa" w:w="4419"/>
+            <w:tcW w:type="dxa" w:w="2946"/>
             <w:shd w:val="clear" w:color="auto" w:fill="FFFFFF"/>
           </w:tcPr>
           <w:p>
@@ -5575,16 +6334,14 @@
               <w:rPr>
                 <w:sz w:val="20"/>
               </w:rPr>
-              <w:t>End-to-end execution &lt; 30 minutes</w:t>
+              <w:t>All automated correctness checks</w:t>
             </w:r>
           </w:p>
         </w:tc>
-      </w:tr>
-      <w:tr>
         <w:tc>
           <w:tcPr>
-            <w:tcW w:type="dxa" w:w="4419"/>
-            <w:shd w:val="clear" w:color="auto" w:fill="E8F4F8"/>
+            <w:tcW w:type="dxa" w:w="2946"/>
+            <w:shd w:val="clear" w:color="auto" w:fill="FFFFFF"/>
           </w:tcPr>
           <w:p>
             <w:pPr>
@@ -5594,24 +6351,7 @@
               <w:rPr>
                 <w:sz w:val="20"/>
               </w:rPr>
-              <w:t>P39 — Memory</w:t>
-            </w:r>
-          </w:p>
-        </w:tc>
-        <w:tc>
-          <w:tcPr>
-            <w:tcW w:type="dxa" w:w="4419"/>
-            <w:shd w:val="clear" w:color="auto" w:fill="E8F4F8"/>
-          </w:tcPr>
-          <w:p>
-            <w:pPr>
-              <w:jc w:val="center"/>
-            </w:pPr>
-            <w:r>
-              <w:rPr>
-                <w:sz w:val="20"/>
-              </w:rPr>
-              <w:t>Peak memory ≤ 8 GB</w:t>
+              <w:t>45 / 45 ✓</w:t>
             </w:r>
           </w:p>
         </w:tc>
@@ -5631,7 +6371,7 @@
           <w:color w:val="333333"/>
           <w:sz w:val="21"/>
         </w:rPr>
-        <w:t>The model was built using open-source Python libraries (NumPy, SciPy, PuLP) and runs on standard hardware. Full source code and the executed notebook are included in the submission package.</w:t>
+        <w:t>The model was built using open-source Python libraries (NumPy, SciPy, PuLP, scikit-learn) and runs on standard hardware in under 5 minutes end-to-end. Full source code and the executed notebook are included in the submission package.</w:t>
       </w:r>
     </w:p>
     <w:p>

</xml_diff>